<commit_message>
Updated release notes for 3.28.0
</commit_message>
<xml_diff>
--- a/doc/release/HPC DME Release Notes 3.28.0.docx
+++ b/doc/release/HPC DME Release Notes 3.28.0.docx
@@ -3720,8 +3720,8 @@
             <w:bookmarkStart w:id="1" w:name="OLE_LINK27"/>
             <w:bookmarkStart w:id="2" w:name="OLE_LINK3"/>
             <w:bookmarkStart w:id="3" w:name="OLE_LINK73"/>
-            <w:bookmarkStart w:id="4" w:name="OLE_LINK12"/>
-            <w:bookmarkStart w:id="5" w:name="OLE_LINK14"/>
+            <w:bookmarkStart w:id="4" w:name="OLE_LINK14"/>
+            <w:bookmarkStart w:id="5" w:name="OLE_LINK12"/>
             <w:r>
               <w:rPr>
                 <w:rFonts w:ascii="Aptos" w:hAnsi="Aptos"/>
@@ -3855,9 +3855,8 @@
               <w:pStyle w:val="NormalWeb"/>
               <w:spacing w:before="0" w:beforeAutospacing="0" w:after="0" w:afterAutospacing="0"/>
               <w:rPr>
-                <w:rFonts w:ascii="Aptos" w:hAnsi="Aptos"/>
-                <w:b/>
-                <w:bCs/>
+                <w:rStyle w:val="Strong"/>
+                <w:rFonts w:ascii="Aptos" w:hAnsi="Aptos"/>
                 <w:color w:val="0E101A"/>
                 <w:sz w:val="22"/>
                 <w:szCs w:val="22"/>
@@ -3915,935 +3914,306 @@
             <w:bookmarkStart w:id="17" w:name="OLE_LINK1"/>
             <w:bookmarkStart w:id="18" w:name="OLE_LINK6"/>
             <w:bookmarkStart w:id="19" w:name="OLE_LINK11"/>
-          </w:p>
-          <w:p>
-            <w:pPr>
-              <w:pStyle w:val="paragraph"/>
-              <w:spacing w:before="0" w:beforeAutospacing="0" w:after="120" w:afterAutospacing="0"/>
-              <w:textAlignment w:val="baseline"/>
-              <w:rPr>
-                <w:rFonts w:ascii="Aptos" w:hAnsi="Aptos" w:cstheme="minorHAnsi"/>
-                <w:sz w:val="22"/>
-                <w:szCs w:val="22"/>
-                <w:u w:val="single"/>
-              </w:rPr>
-            </w:pPr>
             <w:bookmarkStart w:id="20" w:name="OLE_LINK119"/>
             <w:bookmarkStart w:id="21" w:name="OLE_LINK116"/>
             <w:bookmarkStart w:id="22" w:name="OLE_LINK13"/>
             <w:bookmarkStart w:id="23" w:name="OLE_LINK4"/>
             <w:bookmarkStart w:id="24" w:name="OLE_LINK18"/>
+            <w:bookmarkStart w:id="25" w:name="OLE_LINK32"/>
             <w:bookmarkEnd w:id="13"/>
           </w:p>
           <w:p>
             <w:pPr>
-              <w:pStyle w:val="paragraph"/>
-              <w:spacing w:before="120" w:beforeAutospacing="0"/>
-              <w:textAlignment w:val="baseline"/>
-              <w:rPr>
-                <w:rFonts w:ascii="Aptos" w:hAnsi="Aptos" w:cstheme="minorHAnsi"/>
-                <w:sz w:val="22"/>
-                <w:szCs w:val="22"/>
-              </w:rPr>
-            </w:pPr>
-            <w:bookmarkStart w:id="25" w:name="OLE_LINK32"/>
-            <w:r>
-              <w:rPr>
-                <w:rFonts w:ascii="Aptos" w:hAnsi="Aptos" w:cstheme="minorHAnsi"/>
-                <w:color w:val="000000" w:themeColor="text1"/>
+              <w:pStyle w:val="NormalWeb"/>
+              <w:spacing w:before="0" w:beforeAutospacing="0" w:after="0" w:afterAutospacing="0"/>
+              <w:rPr>
+                <w:rFonts w:ascii="Aptos" w:hAnsi="Aptos"/>
+                <w:b/>
+                <w:bCs/>
+                <w:color w:val="0E101A"/>
                 <w:sz w:val="22"/>
                 <w:szCs w:val="22"/>
                 <w:u w:val="single"/>
               </w:rPr>
-              <w:t>HPCDATAMGM-</w:t>
-            </w:r>
-            <w:r>
-              <w:rPr>
-                <w:rFonts w:ascii="Aptos" w:hAnsi="Aptos" w:cstheme="minorHAnsi"/>
-                <w:color w:val="000000" w:themeColor="text1"/>
+            </w:pPr>
+          </w:p>
+          <w:p>
+            <w:pPr>
+              <w:rPr>
+                <w:rFonts w:ascii="Aptos" w:hAnsi="Aptos" w:cs="Arial"/>
+                <w:color w:val="000000"/>
+                <w:sz w:val="22"/>
+                <w:szCs w:val="22"/>
+              </w:rPr>
+            </w:pPr>
+            <w:r>
+              <w:rPr>
+                <w:rFonts w:ascii="Aptos" w:hAnsi="Aptos" w:cs="Arial"/>
+                <w:color w:val="000000"/>
                 <w:sz w:val="22"/>
                 <w:szCs w:val="22"/>
                 <w:u w:val="single"/>
               </w:rPr>
-              <w:t>2</w:t>
-            </w:r>
-            <w:r>
-              <w:rPr>
-                <w:rFonts w:ascii="Aptos" w:hAnsi="Aptos" w:cstheme="minorHAnsi"/>
-                <w:color w:val="000000" w:themeColor="text1"/>
-                <w:sz w:val="22"/>
-                <w:szCs w:val="22"/>
-                <w:u w:val="single"/>
-              </w:rPr>
-              <w:t>211</w:t>
-            </w:r>
-            <w:r>
-              <w:rPr>
-                <w:rFonts w:ascii="Aptos" w:hAnsi="Aptos" w:cstheme="minorHAnsi"/>
-                <w:color w:val="000000" w:themeColor="text1"/>
-                <w:sz w:val="22"/>
-                <w:szCs w:val="22"/>
-                <w:u w:val="single"/>
-              </w:rPr>
-              <w:t>:</w:t>
-            </w:r>
-            <w:r>
-              <w:rPr>
-                <w:rFonts w:ascii="Aptos" w:hAnsi="Aptos" w:cstheme="minorHAnsi"/>
-                <w:color w:val="000000" w:themeColor="text1"/>
-                <w:sz w:val="22"/>
-                <w:szCs w:val="22"/>
-              </w:rPr>
-              <w:t xml:space="preserve">  </w:t>
-            </w:r>
-            <w:r>
-              <w:rPr>
-                <w:rFonts w:ascii="Aptos" w:hAnsi="Aptos"/>
-                <w:sz w:val="22"/>
-                <w:szCs w:val="22"/>
-              </w:rPr>
-              <w:t xml:space="preserve">Display the </w:t>
-            </w:r>
-            <w:r>
-              <w:rPr>
-                <w:rFonts w:ascii="Aptos" w:hAnsi="Aptos"/>
-                <w:sz w:val="22"/>
-                <w:szCs w:val="22"/>
-              </w:rPr>
-              <w:t xml:space="preserve">size of the file (in the </w:t>
-            </w:r>
-            <w:r>
-              <w:rPr>
-                <w:rFonts w:ascii="Aptos" w:hAnsi="Aptos"/>
-                <w:sz w:val="22"/>
-                <w:szCs w:val="22"/>
-              </w:rPr>
-              <w:t>File Size</w:t>
-            </w:r>
-            <w:r>
-              <w:rPr>
-                <w:rFonts w:ascii="Aptos" w:hAnsi="Aptos"/>
-                <w:sz w:val="22"/>
-                <w:szCs w:val="22"/>
-              </w:rPr>
-              <w:t xml:space="preserve"> column) in </w:t>
-            </w:r>
-            <w:r>
-              <w:rPr>
-                <w:rFonts w:ascii="Aptos" w:hAnsi="Aptos"/>
-                <w:sz w:val="22"/>
-                <w:szCs w:val="22"/>
-              </w:rPr>
-              <w:t xml:space="preserve">the File Table </w:t>
-            </w:r>
-            <w:r>
-              <w:rPr>
-                <w:rFonts w:ascii="Aptos" w:hAnsi="Aptos"/>
-                <w:sz w:val="22"/>
-                <w:szCs w:val="22"/>
-              </w:rPr>
-              <w:t>of</w:t>
-            </w:r>
-            <w:r>
-              <w:rPr>
-                <w:rFonts w:ascii="Aptos" w:hAnsi="Aptos"/>
-                <w:sz w:val="22"/>
-                <w:szCs w:val="22"/>
-              </w:rPr>
-              <w:t xml:space="preserve"> </w:t>
-            </w:r>
-            <w:r>
-              <w:rPr>
-                <w:rFonts w:ascii="Aptos" w:hAnsi="Aptos"/>
-                <w:sz w:val="22"/>
-                <w:szCs w:val="22"/>
-              </w:rPr>
-              <w:t xml:space="preserve">the </w:t>
-            </w:r>
-            <w:r>
-              <w:rPr>
-                <w:rFonts w:ascii="Aptos" w:hAnsi="Aptos"/>
-                <w:sz w:val="22"/>
-                <w:szCs w:val="22"/>
-              </w:rPr>
-              <w:t xml:space="preserve">Browse screen </w:t>
-            </w:r>
-            <w:r>
-              <w:rPr>
-                <w:rFonts w:ascii="Aptos" w:hAnsi="Aptos"/>
-                <w:sz w:val="22"/>
-                <w:szCs w:val="22"/>
-              </w:rPr>
-              <w:t xml:space="preserve">of the DME web application </w:t>
-            </w:r>
-            <w:r>
-              <w:rPr>
-                <w:rFonts w:ascii="Aptos" w:hAnsi="Aptos"/>
-                <w:sz w:val="22"/>
-                <w:szCs w:val="22"/>
-              </w:rPr>
-              <w:t>in human</w:t>
-            </w:r>
-            <w:r>
-              <w:rPr>
-                <w:rFonts w:ascii="Aptos" w:hAnsi="Aptos"/>
-                <w:sz w:val="22"/>
-                <w:szCs w:val="22"/>
-              </w:rPr>
-              <w:t>-</w:t>
-            </w:r>
-            <w:r>
-              <w:rPr>
-                <w:rFonts w:ascii="Aptos" w:hAnsi="Aptos"/>
-                <w:sz w:val="22"/>
-                <w:szCs w:val="22"/>
-              </w:rPr>
-              <w:t>readable format. Pre</w:t>
-            </w:r>
-            <w:r>
-              <w:rPr>
-                <w:rFonts w:ascii="Aptos" w:hAnsi="Aptos"/>
-                <w:sz w:val="22"/>
-                <w:szCs w:val="22"/>
-              </w:rPr>
-              <w:t>viously,</w:t>
-            </w:r>
-            <w:r>
-              <w:rPr>
-                <w:rFonts w:ascii="Aptos" w:hAnsi="Aptos"/>
-                <w:sz w:val="22"/>
-                <w:szCs w:val="22"/>
-              </w:rPr>
-              <w:t xml:space="preserve"> it </w:t>
-            </w:r>
-            <w:r>
-              <w:rPr>
-                <w:rFonts w:ascii="Aptos" w:hAnsi="Aptos"/>
-                <w:sz w:val="22"/>
-                <w:szCs w:val="22"/>
-              </w:rPr>
-              <w:t>was</w:t>
-            </w:r>
-            <w:r>
-              <w:rPr>
-                <w:rFonts w:ascii="Aptos" w:hAnsi="Aptos"/>
-                <w:sz w:val="22"/>
-                <w:szCs w:val="22"/>
-              </w:rPr>
-              <w:t xml:space="preserve"> displayed in bytes</w:t>
-            </w:r>
-            <w:r>
-              <w:rPr>
-                <w:rFonts w:ascii="Aptos" w:hAnsi="Aptos"/>
-                <w:sz w:val="22"/>
-                <w:szCs w:val="22"/>
-              </w:rPr>
-              <w:t xml:space="preserve"> only</w:t>
-            </w:r>
-            <w:r>
-              <w:rPr>
-                <w:rFonts w:ascii="Aptos" w:hAnsi="Aptos"/>
-                <w:sz w:val="22"/>
-                <w:szCs w:val="22"/>
-              </w:rPr>
-              <w:t>.</w:t>
-            </w:r>
-          </w:p>
-          <w:p>
-            <w:pPr>
-              <w:pStyle w:val="paragraph"/>
-              <w:spacing w:before="120" w:beforeAutospacing="0"/>
-              <w:textAlignment w:val="baseline"/>
-              <w:rPr>
-                <w:rFonts w:ascii="Aptos" w:hAnsi="Aptos" w:cs="Segoe UI"/>
-                <w:color w:val="000000" w:themeColor="text1"/>
-                <w:sz w:val="22"/>
-                <w:szCs w:val="22"/>
-                <w:shd w:val="clear" w:color="auto" w:fill="FFFFFF"/>
-              </w:rPr>
-            </w:pPr>
-            <w:bookmarkStart w:id="26" w:name="OLE_LINK46"/>
-            <w:bookmarkEnd w:id="14"/>
-            <w:bookmarkEnd w:id="15"/>
-            <w:bookmarkEnd w:id="16"/>
-            <w:bookmarkEnd w:id="17"/>
-            <w:bookmarkEnd w:id="18"/>
-            <w:bookmarkEnd w:id="19"/>
-            <w:bookmarkEnd w:id="20"/>
-            <w:bookmarkEnd w:id="21"/>
-            <w:bookmarkEnd w:id="22"/>
-            <w:r>
-              <w:rPr>
-                <w:rFonts w:ascii="Aptos" w:hAnsi="Aptos" w:cs="Segoe UI"/>
-                <w:color w:val="000000" w:themeColor="text1"/>
+              <w:t>HPCDATAMGM-2211:</w:t>
+            </w:r>
+            <w:r>
+              <w:rPr>
+                <w:rFonts w:ascii="Aptos" w:hAnsi="Aptos" w:cs="Arial"/>
+                <w:color w:val="000000"/>
+                <w:sz w:val="22"/>
+                <w:szCs w:val="22"/>
+              </w:rPr>
+              <w:t>  Enhanced the File Table in the Browse screen of the DME web application to display the sizes of the files (in the File Size column) in human-readable format. Previously, the size was displayed in bytes only.</w:t>
+            </w:r>
+          </w:p>
+          <w:p>
+            <w:pPr>
+              <w:ind w:left="720"/>
+              <w:rPr>
+                <w:rFonts w:ascii="Aptos" w:hAnsi="Aptos" w:cs="Arial"/>
+                <w:color w:val="000000"/>
+                <w:sz w:val="22"/>
+                <w:szCs w:val="22"/>
+              </w:rPr>
+            </w:pPr>
+          </w:p>
+          <w:p>
+            <w:pPr>
+              <w:pStyle w:val="NormalWeb"/>
+              <w:spacing w:before="0" w:beforeAutospacing="0" w:after="0"/>
+              <w:rPr>
+                <w:rFonts w:ascii="Arial" w:hAnsi="Arial" w:cs="Arial"/>
+                <w:color w:val="000000"/>
+                <w:sz w:val="22"/>
+                <w:szCs w:val="22"/>
+              </w:rPr>
+            </w:pPr>
+            <w:r>
+              <w:rPr>
+                <w:rFonts w:ascii="Aptos" w:hAnsi="Aptos" w:cs="Arial"/>
+                <w:color w:val="000000"/>
                 <w:sz w:val="22"/>
                 <w:szCs w:val="22"/>
                 <w:u w:val="single"/>
                 <w:shd w:val="clear" w:color="auto" w:fill="FFFFFF"/>
               </w:rPr>
-              <w:t>HPCDATAMGM-2</w:t>
-            </w:r>
-            <w:r>
-              <w:rPr>
-                <w:rFonts w:ascii="Aptos" w:hAnsi="Aptos" w:cs="Segoe UI"/>
-                <w:color w:val="000000" w:themeColor="text1"/>
+              <w:t>HPCDATAMGM-2204</w:t>
+            </w:r>
+            <w:r>
+              <w:rPr>
+                <w:rFonts w:ascii="Aptos" w:hAnsi="Aptos" w:cs="Arial"/>
+                <w:color w:val="000000"/>
+                <w:sz w:val="22"/>
+                <w:szCs w:val="22"/>
+                <w:shd w:val="clear" w:color="auto" w:fill="FFFFFF"/>
+              </w:rPr>
+              <w:t>:</w:t>
+            </w:r>
+            <w:r>
+              <w:rPr>
+                <w:rStyle w:val="apple-converted-space"/>
+                <w:rFonts w:ascii="Aptos" w:hAnsi="Aptos" w:cs="Arial"/>
+                <w:color w:val="000000"/>
+                <w:sz w:val="22"/>
+                <w:szCs w:val="22"/>
+                <w:shd w:val="clear" w:color="auto" w:fill="FFFFFF"/>
+              </w:rPr>
+              <w:t> </w:t>
+            </w:r>
+            <w:r>
+              <w:rPr>
+                <w:rFonts w:ascii="Aptos" w:hAnsi="Aptos" w:cs="Arial"/>
+                <w:color w:val="000000"/>
+                <w:sz w:val="22"/>
+                <w:szCs w:val="22"/>
+                <w:shd w:val="clear" w:color="auto" w:fill="FFFFFF"/>
+              </w:rPr>
+              <w:t>Added a new Collection Access Distribution report in the Reports page of the DME web application to show the distribution of collections in an archive based on the last accessed time. This will be accessible to the group administrators.</w:t>
+            </w:r>
+          </w:p>
+          <w:p>
+            <w:pPr>
+              <w:pStyle w:val="NormalWeb"/>
+              <w:spacing w:before="120" w:beforeAutospacing="0"/>
+              <w:rPr>
+                <w:rFonts w:ascii="Arial" w:hAnsi="Arial" w:cs="Arial"/>
+                <w:color w:val="000000"/>
+                <w:sz w:val="22"/>
+                <w:szCs w:val="22"/>
+              </w:rPr>
+            </w:pPr>
+            <w:r>
+              <w:rPr>
+                <w:rFonts w:ascii="Aptos" w:hAnsi="Aptos" w:cs="Arial"/>
+                <w:color w:val="000000"/>
                 <w:sz w:val="22"/>
                 <w:szCs w:val="22"/>
                 <w:u w:val="single"/>
                 <w:shd w:val="clear" w:color="auto" w:fill="FFFFFF"/>
               </w:rPr>
-              <w:t>204</w:t>
-            </w:r>
-            <w:r>
-              <w:rPr>
-                <w:rFonts w:ascii="Aptos" w:hAnsi="Aptos" w:cs="Segoe UI"/>
-                <w:color w:val="000000" w:themeColor="text1"/>
+              <w:t>HPCDATAMGM-2202</w:t>
+            </w:r>
+            <w:r>
+              <w:rPr>
+                <w:rFonts w:ascii="Aptos" w:hAnsi="Aptos" w:cs="Arial"/>
+                <w:color w:val="000000"/>
                 <w:sz w:val="22"/>
                 <w:szCs w:val="22"/>
                 <w:shd w:val="clear" w:color="auto" w:fill="FFFFFF"/>
               </w:rPr>
-              <w:t xml:space="preserve">: </w:t>
-            </w:r>
-            <w:bookmarkStart w:id="27" w:name="OLE_LINK47"/>
-            <w:r>
-              <w:rPr>
-                <w:rFonts w:ascii="Aptos" w:hAnsi="Aptos" w:cs="Segoe UI"/>
-                <w:color w:val="000000" w:themeColor="text1"/>
-                <w:sz w:val="22"/>
-                <w:szCs w:val="22"/>
-                <w:shd w:val="clear" w:color="auto" w:fill="FFFFFF"/>
-              </w:rPr>
-              <w:t>Added</w:t>
-            </w:r>
-            <w:r>
-              <w:rPr>
-                <w:rFonts w:ascii="Aptos" w:hAnsi="Aptos" w:cs="Segoe UI"/>
-                <w:color w:val="000000" w:themeColor="text1"/>
-                <w:sz w:val="22"/>
-                <w:szCs w:val="22"/>
-                <w:shd w:val="clear" w:color="auto" w:fill="FFFFFF"/>
-              </w:rPr>
-              <w:t xml:space="preserve"> a </w:t>
-            </w:r>
-            <w:r>
-              <w:rPr>
-                <w:rFonts w:ascii="Aptos" w:hAnsi="Aptos" w:cs="Segoe UI"/>
-                <w:color w:val="000000" w:themeColor="text1"/>
-                <w:sz w:val="22"/>
-                <w:szCs w:val="22"/>
-                <w:shd w:val="clear" w:color="auto" w:fill="FFFFFF"/>
-              </w:rPr>
-              <w:t>new Collection Access Distribution r</w:t>
-            </w:r>
-            <w:r>
-              <w:rPr>
-                <w:rFonts w:ascii="Aptos" w:hAnsi="Aptos" w:cs="Segoe UI"/>
-                <w:color w:val="000000" w:themeColor="text1"/>
-                <w:sz w:val="22"/>
-                <w:szCs w:val="22"/>
-                <w:shd w:val="clear" w:color="auto" w:fill="FFFFFF"/>
-              </w:rPr>
-              <w:t xml:space="preserve">eport </w:t>
-            </w:r>
-            <w:r>
-              <w:rPr>
-                <w:rFonts w:ascii="Aptos" w:hAnsi="Aptos" w:cs="Segoe UI"/>
-                <w:color w:val="000000" w:themeColor="text1"/>
-                <w:sz w:val="22"/>
-                <w:szCs w:val="22"/>
-                <w:shd w:val="clear" w:color="auto" w:fill="FFFFFF"/>
-              </w:rPr>
-              <w:t xml:space="preserve">in the Reports page </w:t>
-            </w:r>
-            <w:r>
-              <w:rPr>
-                <w:rFonts w:ascii="Aptos" w:hAnsi="Aptos" w:cs="Segoe UI"/>
-                <w:color w:val="000000" w:themeColor="text1"/>
-                <w:sz w:val="22"/>
-                <w:szCs w:val="22"/>
-                <w:shd w:val="clear" w:color="auto" w:fill="FFFFFF"/>
-              </w:rPr>
-              <w:t xml:space="preserve">of the DME web application </w:t>
-            </w:r>
-            <w:r>
-              <w:rPr>
-                <w:rFonts w:ascii="Aptos" w:hAnsi="Aptos" w:cs="Segoe UI"/>
-                <w:color w:val="000000" w:themeColor="text1"/>
-                <w:sz w:val="22"/>
-                <w:szCs w:val="22"/>
-                <w:shd w:val="clear" w:color="auto" w:fill="FFFFFF"/>
-              </w:rPr>
-              <w:t xml:space="preserve">to </w:t>
-            </w:r>
-            <w:r>
-              <w:rPr>
-                <w:rFonts w:ascii="Aptos" w:hAnsi="Aptos" w:cs="Segoe UI"/>
-                <w:color w:val="000000" w:themeColor="text1"/>
-                <w:sz w:val="22"/>
-                <w:szCs w:val="22"/>
-                <w:shd w:val="clear" w:color="auto" w:fill="FFFFFF"/>
-              </w:rPr>
-              <w:t>show</w:t>
-            </w:r>
-            <w:r>
-              <w:rPr>
-                <w:rFonts w:ascii="Aptos" w:hAnsi="Aptos" w:cs="Segoe UI"/>
-                <w:color w:val="000000" w:themeColor="text1"/>
-                <w:sz w:val="22"/>
-                <w:szCs w:val="22"/>
-                <w:shd w:val="clear" w:color="auto" w:fill="FFFFFF"/>
-              </w:rPr>
-              <w:t xml:space="preserve"> the distribution of collections </w:t>
-            </w:r>
-            <w:r>
-              <w:rPr>
-                <w:rFonts w:ascii="Aptos" w:hAnsi="Aptos" w:cs="Segoe UI"/>
-                <w:color w:val="000000" w:themeColor="text1"/>
-                <w:sz w:val="22"/>
-                <w:szCs w:val="22"/>
-                <w:shd w:val="clear" w:color="auto" w:fill="FFFFFF"/>
-              </w:rPr>
-              <w:t xml:space="preserve">in an archive </w:t>
-            </w:r>
-            <w:r>
-              <w:rPr>
-                <w:rFonts w:ascii="Aptos" w:hAnsi="Aptos" w:cs="Segoe UI"/>
-                <w:color w:val="000000" w:themeColor="text1"/>
-                <w:sz w:val="22"/>
-                <w:szCs w:val="22"/>
-                <w:shd w:val="clear" w:color="auto" w:fill="FFFFFF"/>
-              </w:rPr>
-              <w:t xml:space="preserve">based on the last accessed time. </w:t>
-            </w:r>
-            <w:r>
-              <w:rPr>
-                <w:rFonts w:ascii="Aptos" w:hAnsi="Aptos" w:cs="Segoe UI"/>
-                <w:color w:val="000000" w:themeColor="text1"/>
-                <w:sz w:val="22"/>
-                <w:szCs w:val="22"/>
-                <w:shd w:val="clear" w:color="auto" w:fill="FFFFFF"/>
-              </w:rPr>
-              <w:t>This will be accessible to the group administrators.</w:t>
-            </w:r>
-          </w:p>
-          <w:p>
-            <w:pPr>
-              <w:pStyle w:val="paragraph"/>
+              <w:t>: Added a new Last Accessed Data Object Report in the Reports page of the DME web application to show the last accessed time of all the files within a specified collection. This will be accessible to the group administrators.</w:t>
+            </w:r>
+          </w:p>
+          <w:p>
+            <w:pPr>
+              <w:pStyle w:val="NormalWeb"/>
               <w:spacing w:before="120" w:beforeAutospacing="0"/>
-              <w:textAlignment w:val="baseline"/>
-              <w:rPr>
-                <w:rFonts w:ascii="Aptos" w:hAnsi="Aptos" w:cs="Segoe UI"/>
-                <w:color w:val="000000" w:themeColor="text1"/>
-                <w:sz w:val="22"/>
-                <w:szCs w:val="22"/>
-                <w:shd w:val="clear" w:color="auto" w:fill="FFFFFF"/>
-              </w:rPr>
-            </w:pPr>
-            <w:r>
-              <w:rPr>
-                <w:rFonts w:ascii="Aptos" w:hAnsi="Aptos" w:cs="Segoe UI"/>
-                <w:color w:val="000000" w:themeColor="text1"/>
+              <w:rPr>
+                <w:rFonts w:ascii="Arial" w:hAnsi="Arial" w:cs="Arial"/>
+                <w:color w:val="000000"/>
+                <w:sz w:val="22"/>
+                <w:szCs w:val="22"/>
+              </w:rPr>
+            </w:pPr>
+            <w:r>
+              <w:rPr>
+                <w:rFonts w:ascii="Aptos" w:hAnsi="Aptos" w:cs="Arial"/>
+                <w:color w:val="000000"/>
                 <w:sz w:val="22"/>
                 <w:szCs w:val="22"/>
                 <w:u w:val="single"/>
                 <w:shd w:val="clear" w:color="auto" w:fill="FFFFFF"/>
               </w:rPr>
-              <w:t>HPCDATAMGM-2</w:t>
-            </w:r>
-            <w:r>
-              <w:rPr>
-                <w:rFonts w:ascii="Aptos" w:hAnsi="Aptos" w:cs="Segoe UI"/>
-                <w:color w:val="000000" w:themeColor="text1"/>
+              <w:t>DMESUPPORT-218: </w:t>
+            </w:r>
+            <w:r>
+              <w:rPr>
+                <w:rStyle w:val="apple-converted-space"/>
+                <w:rFonts w:ascii="Aptos" w:hAnsi="Aptos" w:cs="Arial"/>
+                <w:color w:val="000000"/>
                 <w:sz w:val="22"/>
                 <w:szCs w:val="22"/>
                 <w:u w:val="single"/>
                 <w:shd w:val="clear" w:color="auto" w:fill="FFFFFF"/>
               </w:rPr>
-              <w:t>202</w:t>
-            </w:r>
-            <w:r>
-              <w:rPr>
-                <w:rFonts w:ascii="Aptos" w:hAnsi="Aptos" w:cs="Segoe UI"/>
-                <w:color w:val="000000" w:themeColor="text1"/>
+              <w:t> </w:t>
+            </w:r>
+            <w:r>
+              <w:rPr>
+                <w:rFonts w:ascii="Aptos" w:hAnsi="Aptos" w:cs="Arial"/>
+                <w:color w:val="000000"/>
                 <w:sz w:val="22"/>
                 <w:szCs w:val="22"/>
                 <w:shd w:val="clear" w:color="auto" w:fill="FFFFFF"/>
               </w:rPr>
-              <w:t xml:space="preserve">: </w:t>
-            </w:r>
-            <w:r>
-              <w:rPr>
-                <w:rFonts w:ascii="Aptos" w:hAnsi="Aptos" w:cs="Segoe UI"/>
-                <w:color w:val="000000" w:themeColor="text1"/>
-                <w:sz w:val="22"/>
-                <w:szCs w:val="22"/>
-                <w:shd w:val="clear" w:color="auto" w:fill="FFFFFF"/>
-              </w:rPr>
-              <w:t xml:space="preserve">Added </w:t>
-            </w:r>
-            <w:r>
-              <w:rPr>
-                <w:rFonts w:ascii="Aptos" w:hAnsi="Aptos" w:cs="Segoe UI"/>
-                <w:color w:val="000000" w:themeColor="text1"/>
-                <w:sz w:val="22"/>
-                <w:szCs w:val="22"/>
-                <w:shd w:val="clear" w:color="auto" w:fill="FFFFFF"/>
-              </w:rPr>
-              <w:t xml:space="preserve">a </w:t>
-            </w:r>
-            <w:r>
-              <w:rPr>
-                <w:rFonts w:ascii="Aptos" w:hAnsi="Aptos" w:cs="Segoe UI"/>
-                <w:color w:val="000000" w:themeColor="text1"/>
-                <w:sz w:val="22"/>
-                <w:szCs w:val="22"/>
-                <w:shd w:val="clear" w:color="auto" w:fill="FFFFFF"/>
-              </w:rPr>
-              <w:t xml:space="preserve">new </w:t>
-            </w:r>
-            <w:r>
-              <w:rPr>
-                <w:rFonts w:ascii="Aptos" w:hAnsi="Aptos" w:cs="Segoe UI"/>
-                <w:color w:val="000000" w:themeColor="text1"/>
-                <w:sz w:val="22"/>
-                <w:szCs w:val="22"/>
-                <w:shd w:val="clear" w:color="auto" w:fill="FFFFFF"/>
-              </w:rPr>
-              <w:t xml:space="preserve">Last Accessed </w:t>
-            </w:r>
-            <w:r>
-              <w:rPr>
-                <w:rFonts w:ascii="Aptos" w:hAnsi="Aptos" w:cs="Segoe UI"/>
-                <w:color w:val="000000" w:themeColor="text1"/>
-                <w:sz w:val="22"/>
-                <w:szCs w:val="22"/>
-                <w:shd w:val="clear" w:color="auto" w:fill="FFFFFF"/>
-              </w:rPr>
-              <w:t>Data</w:t>
-            </w:r>
-            <w:r>
-              <w:rPr>
-                <w:rFonts w:ascii="Aptos" w:hAnsi="Aptos" w:cs="Segoe UI"/>
-                <w:color w:val="000000" w:themeColor="text1"/>
-                <w:sz w:val="22"/>
-                <w:szCs w:val="22"/>
-                <w:shd w:val="clear" w:color="auto" w:fill="FFFFFF"/>
-              </w:rPr>
-              <w:t xml:space="preserve"> </w:t>
-            </w:r>
-            <w:r>
-              <w:rPr>
-                <w:rFonts w:ascii="Aptos" w:hAnsi="Aptos" w:cs="Segoe UI"/>
-                <w:color w:val="000000" w:themeColor="text1"/>
-                <w:sz w:val="22"/>
-                <w:szCs w:val="22"/>
-                <w:shd w:val="clear" w:color="auto" w:fill="FFFFFF"/>
-              </w:rPr>
-              <w:t xml:space="preserve">Object </w:t>
-            </w:r>
-            <w:r>
-              <w:rPr>
-                <w:rFonts w:ascii="Aptos" w:hAnsi="Aptos" w:cs="Segoe UI"/>
-                <w:color w:val="000000" w:themeColor="text1"/>
-                <w:sz w:val="22"/>
-                <w:szCs w:val="22"/>
-                <w:shd w:val="clear" w:color="auto" w:fill="FFFFFF"/>
-              </w:rPr>
-              <w:t xml:space="preserve">Report </w:t>
-            </w:r>
-            <w:r>
-              <w:rPr>
-                <w:rFonts w:ascii="Aptos" w:hAnsi="Aptos" w:cs="Segoe UI"/>
-                <w:color w:val="000000" w:themeColor="text1"/>
-                <w:sz w:val="22"/>
-                <w:szCs w:val="22"/>
-                <w:shd w:val="clear" w:color="auto" w:fill="FFFFFF"/>
-              </w:rPr>
-              <w:t xml:space="preserve">in the Reports page </w:t>
-            </w:r>
-            <w:r>
-              <w:rPr>
-                <w:rFonts w:ascii="Aptos" w:hAnsi="Aptos" w:cs="Segoe UI"/>
-                <w:color w:val="000000" w:themeColor="text1"/>
-                <w:sz w:val="22"/>
-                <w:szCs w:val="22"/>
-                <w:shd w:val="clear" w:color="auto" w:fill="FFFFFF"/>
-              </w:rPr>
-              <w:t xml:space="preserve">of the DME web application </w:t>
-            </w:r>
-            <w:r>
-              <w:rPr>
-                <w:rFonts w:ascii="Aptos" w:hAnsi="Aptos" w:cs="Segoe UI"/>
-                <w:color w:val="000000" w:themeColor="text1"/>
-                <w:sz w:val="22"/>
-                <w:szCs w:val="22"/>
-                <w:shd w:val="clear" w:color="auto" w:fill="FFFFFF"/>
-              </w:rPr>
-              <w:t xml:space="preserve">to </w:t>
-            </w:r>
-            <w:r>
-              <w:rPr>
-                <w:rFonts w:ascii="Aptos" w:hAnsi="Aptos" w:cs="Segoe UI"/>
-                <w:color w:val="000000" w:themeColor="text1"/>
-                <w:sz w:val="22"/>
-                <w:szCs w:val="22"/>
-                <w:shd w:val="clear" w:color="auto" w:fill="FFFFFF"/>
-              </w:rPr>
-              <w:t>show the</w:t>
-            </w:r>
-            <w:r>
-              <w:rPr>
-                <w:rFonts w:ascii="Aptos" w:hAnsi="Aptos" w:cs="Segoe UI"/>
-                <w:color w:val="000000" w:themeColor="text1"/>
-                <w:sz w:val="22"/>
-                <w:szCs w:val="22"/>
-                <w:shd w:val="clear" w:color="auto" w:fill="FFFFFF"/>
-              </w:rPr>
-              <w:t xml:space="preserve"> last accessed time of all the files within a specified collection. </w:t>
-            </w:r>
-            <w:r>
-              <w:rPr>
-                <w:rFonts w:ascii="Aptos" w:hAnsi="Aptos" w:cs="Segoe UI"/>
-                <w:color w:val="000000" w:themeColor="text1"/>
-                <w:sz w:val="22"/>
-                <w:szCs w:val="22"/>
-                <w:shd w:val="clear" w:color="auto" w:fill="FFFFFF"/>
-              </w:rPr>
-              <w:t xml:space="preserve">This will be accessible to the </w:t>
-            </w:r>
-            <w:r>
-              <w:rPr>
-                <w:rFonts w:ascii="Aptos" w:hAnsi="Aptos" w:cs="Segoe UI"/>
-                <w:color w:val="000000" w:themeColor="text1"/>
-                <w:sz w:val="22"/>
-                <w:szCs w:val="22"/>
-                <w:shd w:val="clear" w:color="auto" w:fill="FFFFFF"/>
-              </w:rPr>
-              <w:t>group administrators.</w:t>
-            </w:r>
-          </w:p>
-          <w:p>
-            <w:pPr>
-              <w:pStyle w:val="paragraph"/>
+              <w:t>Enhanced the DME archival workflow to send an automated email notification when the source directory is empty or the scan does not find any files. Previously, an email was sent only if the workflow uploaded at least one file. </w:t>
+            </w:r>
+          </w:p>
+          <w:p>
+            <w:pPr>
+              <w:pStyle w:val="NormalWeb"/>
               <w:spacing w:before="120" w:beforeAutospacing="0"/>
-              <w:textAlignment w:val="baseline"/>
-              <w:rPr>
-                <w:rFonts w:ascii="Aptos" w:hAnsi="Aptos" w:cstheme="minorHAnsi"/>
-                <w:color w:val="000000" w:themeColor="text1"/>
-                <w:sz w:val="22"/>
-                <w:szCs w:val="22"/>
-              </w:rPr>
-            </w:pPr>
-            <w:r>
-              <w:rPr>
-                <w:rFonts w:ascii="Aptos" w:hAnsi="Aptos" w:cs="Segoe UI"/>
-                <w:color w:val="000000" w:themeColor="text1"/>
+              <w:rPr>
+                <w:rFonts w:ascii="Arial" w:hAnsi="Arial" w:cs="Arial"/>
+                <w:color w:val="000000"/>
+                <w:sz w:val="22"/>
+                <w:szCs w:val="22"/>
+              </w:rPr>
+            </w:pPr>
+            <w:r>
+              <w:rPr>
+                <w:rFonts w:ascii="Aptos" w:hAnsi="Aptos" w:cs="Arial"/>
+                <w:color w:val="000000"/>
                 <w:sz w:val="22"/>
                 <w:szCs w:val="22"/>
                 <w:u w:val="single"/>
                 <w:shd w:val="clear" w:color="auto" w:fill="FFFFFF"/>
               </w:rPr>
-              <w:t xml:space="preserve">DMESUPPORT-218:  </w:t>
-            </w:r>
-            <w:r>
-              <w:rPr>
-                <w:rFonts w:ascii="Segoe UI" w:hAnsi="Segoe UI" w:cs="Segoe UI"/>
-                <w:color w:val="000000" w:themeColor="text1"/>
-                <w:sz w:val="21"/>
-                <w:szCs w:val="21"/>
+              <w:t>DMESUPPORT-220:</w:t>
+            </w:r>
+            <w:r>
+              <w:rPr>
+                <w:rFonts w:ascii="Aptos" w:hAnsi="Aptos" w:cs="Arial"/>
+                <w:color w:val="000000"/>
+                <w:sz w:val="22"/>
+                <w:szCs w:val="22"/>
                 <w:shd w:val="clear" w:color="auto" w:fill="FFFFFF"/>
               </w:rPr>
-              <w:t>Enhance</w:t>
-            </w:r>
-            <w:r>
-              <w:rPr>
-                <w:rFonts w:ascii="Segoe UI" w:hAnsi="Segoe UI" w:cs="Segoe UI"/>
-                <w:color w:val="000000" w:themeColor="text1"/>
-                <w:sz w:val="21"/>
-                <w:szCs w:val="21"/>
-                <w:shd w:val="clear" w:color="auto" w:fill="FFFFFF"/>
-              </w:rPr>
-              <w:t>d</w:t>
-            </w:r>
-            <w:r>
-              <w:rPr>
-                <w:rFonts w:ascii="Segoe UI" w:hAnsi="Segoe UI" w:cs="Segoe UI"/>
-                <w:color w:val="000000" w:themeColor="text1"/>
-                <w:sz w:val="21"/>
-                <w:szCs w:val="21"/>
-                <w:shd w:val="clear" w:color="auto" w:fill="FFFFFF"/>
-              </w:rPr>
-              <w:t xml:space="preserve"> the DME archival workflow to send an automated email notification when the source directory is empty or the scan does not find any files. Pre</w:t>
-            </w:r>
-            <w:r>
-              <w:rPr>
-                <w:rFonts w:ascii="Segoe UI" w:hAnsi="Segoe UI" w:cs="Segoe UI"/>
-                <w:color w:val="000000" w:themeColor="text1"/>
-                <w:sz w:val="21"/>
-                <w:szCs w:val="21"/>
-                <w:shd w:val="clear" w:color="auto" w:fill="FFFFFF"/>
-              </w:rPr>
-              <w:t>viously</w:t>
-            </w:r>
-            <w:r>
-              <w:rPr>
-                <w:rFonts w:ascii="Segoe UI" w:hAnsi="Segoe UI" w:cs="Segoe UI"/>
-                <w:color w:val="000000" w:themeColor="text1"/>
-                <w:sz w:val="21"/>
-                <w:szCs w:val="21"/>
-                <w:shd w:val="clear" w:color="auto" w:fill="FFFFFF"/>
-              </w:rPr>
-              <w:t xml:space="preserve">, </w:t>
-            </w:r>
-            <w:r>
-              <w:rPr>
-                <w:rFonts w:ascii="Segoe UI" w:hAnsi="Segoe UI" w:cs="Segoe UI"/>
-                <w:color w:val="000000" w:themeColor="text1"/>
-                <w:sz w:val="21"/>
-                <w:szCs w:val="21"/>
-                <w:shd w:val="clear" w:color="auto" w:fill="FFFFFF"/>
-              </w:rPr>
-              <w:t xml:space="preserve">an email was sent only if </w:t>
-            </w:r>
-            <w:r>
-              <w:rPr>
-                <w:rFonts w:ascii="Segoe UI" w:hAnsi="Segoe UI" w:cs="Segoe UI"/>
-                <w:color w:val="000000" w:themeColor="text1"/>
-                <w:sz w:val="21"/>
-                <w:szCs w:val="21"/>
-                <w:shd w:val="clear" w:color="auto" w:fill="FFFFFF"/>
-              </w:rPr>
-              <w:t>the</w:t>
-            </w:r>
-            <w:r>
-              <w:rPr>
-                <w:rFonts w:ascii="Segoe UI" w:hAnsi="Segoe UI" w:cs="Segoe UI"/>
-                <w:color w:val="000000" w:themeColor="text1"/>
-                <w:sz w:val="21"/>
-                <w:szCs w:val="21"/>
-                <w:shd w:val="clear" w:color="auto" w:fill="FFFFFF"/>
-              </w:rPr>
-              <w:t xml:space="preserve"> workflow uploaded at least one file. </w:t>
-            </w:r>
-          </w:p>
-          <w:p>
-            <w:pPr>
-              <w:pStyle w:val="paragraph"/>
+              <w:t>  Enhanced the Excel attachment in the DME archival workflow email report to highlight in yellow the rows representing failed uploads. </w:t>
+            </w:r>
+          </w:p>
+          <w:p>
+            <w:pPr>
+              <w:pStyle w:val="NormalWeb"/>
               <w:spacing w:before="120" w:beforeAutospacing="0"/>
-              <w:textAlignment w:val="baseline"/>
-              <w:rPr>
-                <w:rFonts w:ascii="Aptos" w:hAnsi="Aptos" w:cs="Segoe UI"/>
-                <w:color w:val="000000" w:themeColor="text1"/>
-                <w:sz w:val="22"/>
-                <w:szCs w:val="22"/>
-                <w:shd w:val="clear" w:color="auto" w:fill="FFFFFF"/>
-              </w:rPr>
-            </w:pPr>
-            <w:r>
-              <w:rPr>
-                <w:rFonts w:ascii="Aptos" w:hAnsi="Aptos" w:cs="Segoe UI"/>
-                <w:color w:val="000000" w:themeColor="text1"/>
+              <w:rPr>
+                <w:rFonts w:ascii="Arial" w:hAnsi="Arial" w:cs="Arial"/>
+                <w:color w:val="000000"/>
+                <w:sz w:val="22"/>
+                <w:szCs w:val="22"/>
+              </w:rPr>
+            </w:pPr>
+            <w:r>
+              <w:rPr>
+                <w:rFonts w:ascii="Aptos" w:hAnsi="Aptos" w:cs="Arial"/>
+                <w:color w:val="000000"/>
                 <w:sz w:val="22"/>
                 <w:szCs w:val="22"/>
                 <w:u w:val="single"/>
                 <w:shd w:val="clear" w:color="auto" w:fill="FFFFFF"/>
               </w:rPr>
-              <w:t>DMESUPPORT-220:</w:t>
-            </w:r>
-            <w:r>
-              <w:rPr>
-                <w:rFonts w:ascii="Aptos" w:hAnsi="Aptos" w:cs="Segoe UI"/>
-                <w:color w:val="000000" w:themeColor="text1"/>
+              <w:t>DMESUPPORT-183:</w:t>
+            </w:r>
+            <w:r>
+              <w:rPr>
+                <w:rFonts w:ascii="Aptos" w:hAnsi="Aptos" w:cs="Arial"/>
+                <w:color w:val="000000"/>
                 <w:sz w:val="22"/>
                 <w:szCs w:val="22"/>
                 <w:shd w:val="clear" w:color="auto" w:fill="FFFFFF"/>
               </w:rPr>
-              <w:t xml:space="preserve"> </w:t>
-            </w:r>
-            <w:r>
-              <w:rPr>
-                <w:rFonts w:ascii="Aptos" w:hAnsi="Aptos" w:cs="Segoe UI"/>
-                <w:color w:val="000000" w:themeColor="text1"/>
+              <w:t> </w:t>
+            </w:r>
+            <w:r>
+              <w:rPr>
+                <w:rFonts w:ascii="Aptos" w:hAnsi="Aptos" w:cs="Arial"/>
+                <w:color w:val="000000"/>
+                <w:sz w:val="22"/>
+                <w:szCs w:val="22"/>
+              </w:rPr>
+              <w:t>Enhanced the DME archival workflow email report to provide a contextual error for upload failures</w:t>
+            </w:r>
+            <w:r>
+              <w:rPr>
+                <w:rStyle w:val="apple-converted-space"/>
+                <w:rFonts w:ascii="Aptos" w:hAnsi="Aptos" w:cs="Arial"/>
+                <w:color w:val="000000"/>
+                <w:sz w:val="22"/>
+                <w:szCs w:val="22"/>
+              </w:rPr>
+              <w:t> </w:t>
+            </w:r>
+            <w:r>
+              <w:rPr>
+                <w:rFonts w:ascii="Aptos" w:hAnsi="Aptos" w:cs="Arial"/>
+                <w:color w:val="000000"/>
                 <w:sz w:val="22"/>
                 <w:szCs w:val="22"/>
                 <w:shd w:val="clear" w:color="auto" w:fill="FFFFFF"/>
               </w:rPr>
-              <w:t xml:space="preserve"> </w:t>
-            </w:r>
-            <w:r>
-              <w:rPr>
-                <w:rFonts w:ascii="Aptos" w:hAnsi="Aptos" w:cs="Segoe UI"/>
-                <w:color w:val="000000" w:themeColor="text1"/>
-                <w:sz w:val="22"/>
-                <w:szCs w:val="22"/>
-                <w:shd w:val="clear" w:color="auto" w:fill="FFFFFF"/>
-              </w:rPr>
-              <w:t xml:space="preserve">Enhanced the DME archival workflow email report to highlight in yellow the rows indicating failed uploads in the Excel </w:t>
-            </w:r>
-            <w:r>
-              <w:rPr>
-                <w:rFonts w:ascii="Aptos" w:hAnsi="Aptos" w:cs="Segoe UI"/>
-                <w:color w:val="000000" w:themeColor="text1"/>
-                <w:sz w:val="22"/>
-                <w:szCs w:val="22"/>
-                <w:shd w:val="clear" w:color="auto" w:fill="FFFFFF"/>
-              </w:rPr>
-              <w:t>attachment</w:t>
-            </w:r>
-            <w:r>
-              <w:rPr>
-                <w:rFonts w:ascii="Aptos" w:hAnsi="Aptos" w:cs="Segoe UI"/>
-                <w:color w:val="000000" w:themeColor="text1"/>
-                <w:sz w:val="22"/>
-                <w:szCs w:val="22"/>
-                <w:shd w:val="clear" w:color="auto" w:fill="FFFFFF"/>
-              </w:rPr>
-              <w:t xml:space="preserve">. </w:t>
-            </w:r>
-          </w:p>
-          <w:p>
-            <w:pPr>
-              <w:pStyle w:val="paragraph"/>
-              <w:spacing w:before="120" w:beforeAutospacing="0"/>
-              <w:textAlignment w:val="baseline"/>
-              <w:rPr>
-                <w:rFonts w:ascii="Aptos" w:hAnsi="Aptos" w:cs="Segoe UI"/>
-                <w:color w:val="000000" w:themeColor="text1"/>
-                <w:sz w:val="22"/>
-                <w:szCs w:val="22"/>
-                <w:shd w:val="clear" w:color="auto" w:fill="FFFFFF"/>
-              </w:rPr>
-            </w:pPr>
-            <w:r>
-              <w:rPr>
-                <w:rFonts w:ascii="Aptos" w:hAnsi="Aptos" w:cs="Segoe UI"/>
-                <w:color w:val="000000" w:themeColor="text1"/>
-                <w:sz w:val="22"/>
-                <w:szCs w:val="22"/>
-                <w:u w:val="single"/>
-                <w:shd w:val="clear" w:color="auto" w:fill="FFFFFF"/>
-              </w:rPr>
-              <w:t>DMESUPPORT-183:</w:t>
-            </w:r>
-            <w:r>
-              <w:rPr>
-                <w:rFonts w:ascii="Aptos" w:hAnsi="Aptos" w:cs="Segoe UI"/>
-                <w:color w:val="000000" w:themeColor="text1"/>
-                <w:sz w:val="22"/>
-                <w:szCs w:val="22"/>
-                <w:shd w:val="clear" w:color="auto" w:fill="FFFFFF"/>
-              </w:rPr>
-              <w:t xml:space="preserve"> </w:t>
-            </w:r>
-            <w:r>
-              <w:rPr>
-                <w:rFonts w:ascii="Aptos" w:hAnsi="Aptos" w:cstheme="minorHAnsi"/>
-                <w:color w:val="000000" w:themeColor="text1"/>
-                <w:sz w:val="22"/>
-                <w:szCs w:val="22"/>
-              </w:rPr>
-              <w:t>Enhance</w:t>
-            </w:r>
-            <w:r>
-              <w:rPr>
-                <w:rFonts w:ascii="Aptos" w:hAnsi="Aptos" w:cstheme="minorHAnsi"/>
-                <w:color w:val="000000" w:themeColor="text1"/>
-                <w:sz w:val="22"/>
-                <w:szCs w:val="22"/>
-              </w:rPr>
-              <w:t>d</w:t>
-            </w:r>
-            <w:r>
-              <w:rPr>
-                <w:rFonts w:ascii="Aptos" w:hAnsi="Aptos" w:cstheme="minorHAnsi"/>
-                <w:color w:val="000000" w:themeColor="text1"/>
-                <w:sz w:val="22"/>
-                <w:szCs w:val="22"/>
-              </w:rPr>
-              <w:t xml:space="preserve"> the DME archival workflow to provide a </w:t>
-            </w:r>
-            <w:r>
-              <w:rPr>
-                <w:rFonts w:ascii="Aptos" w:hAnsi="Aptos" w:cstheme="minorHAnsi"/>
-                <w:color w:val="000000" w:themeColor="text1"/>
-                <w:sz w:val="22"/>
-                <w:szCs w:val="22"/>
-              </w:rPr>
-              <w:t>contextual</w:t>
-            </w:r>
-            <w:r>
-              <w:rPr>
-                <w:rFonts w:ascii="Aptos" w:hAnsi="Aptos" w:cstheme="minorHAnsi"/>
-                <w:color w:val="000000" w:themeColor="text1"/>
-                <w:sz w:val="22"/>
-                <w:szCs w:val="22"/>
-              </w:rPr>
-              <w:t xml:space="preserve"> error in the automated email report for upload failures </w:t>
-            </w:r>
-            <w:r>
-              <w:rPr>
-                <w:rFonts w:ascii="Aptos" w:hAnsi="Aptos" w:cs="Segoe UI"/>
-                <w:color w:val="000000" w:themeColor="text1"/>
-                <w:sz w:val="22"/>
-                <w:szCs w:val="22"/>
-                <w:shd w:val="clear" w:color="auto" w:fill="FFFFFF"/>
-              </w:rPr>
-              <w:t>due to insufficient permissions for the archival workflow. Pre</w:t>
-            </w:r>
-            <w:r>
-              <w:rPr>
-                <w:rFonts w:ascii="Aptos" w:hAnsi="Aptos" w:cs="Segoe UI"/>
-                <w:color w:val="000000" w:themeColor="text1"/>
-                <w:sz w:val="22"/>
-                <w:szCs w:val="22"/>
-                <w:shd w:val="clear" w:color="auto" w:fill="FFFFFF"/>
-              </w:rPr>
-              <w:t>viously</w:t>
-            </w:r>
-            <w:r>
-              <w:rPr>
-                <w:rFonts w:ascii="Aptos" w:hAnsi="Aptos" w:cs="Segoe UI"/>
-                <w:color w:val="000000" w:themeColor="text1"/>
-                <w:sz w:val="22"/>
-                <w:szCs w:val="22"/>
-                <w:shd w:val="clear" w:color="auto" w:fill="FFFFFF"/>
-              </w:rPr>
-              <w:t xml:space="preserve">, </w:t>
-            </w:r>
-            <w:r>
-              <w:rPr>
-                <w:rFonts w:ascii="Aptos" w:hAnsi="Aptos" w:cs="Segoe UI"/>
-                <w:color w:val="000000" w:themeColor="text1"/>
-                <w:sz w:val="22"/>
-                <w:szCs w:val="22"/>
-                <w:shd w:val="clear" w:color="auto" w:fill="FFFFFF"/>
-              </w:rPr>
-              <w:t xml:space="preserve">the workflow provided a </w:t>
-            </w:r>
-            <w:r>
-              <w:rPr>
-                <w:rFonts w:ascii="Aptos" w:hAnsi="Aptos" w:cs="Segoe UI"/>
-                <w:color w:val="000000" w:themeColor="text1"/>
-                <w:sz w:val="22"/>
-                <w:szCs w:val="22"/>
-                <w:shd w:val="clear" w:color="auto" w:fill="FFFFFF"/>
-              </w:rPr>
-              <w:t>generic error message</w:t>
-            </w:r>
-            <w:r>
-              <w:rPr>
-                <w:rFonts w:ascii="Aptos" w:hAnsi="Aptos" w:cs="Segoe UI"/>
-                <w:color w:val="000000" w:themeColor="text1"/>
-                <w:sz w:val="22"/>
-                <w:szCs w:val="22"/>
-                <w:shd w:val="clear" w:color="auto" w:fill="FFFFFF"/>
-              </w:rPr>
-              <w:t>.</w:t>
-            </w:r>
-          </w:p>
+              <w:t>due to insufficient permissions for the archival workflow. Previously, the reported showed a  generic error message.</w:t>
+            </w:r>
+          </w:p>
+          <w:bookmarkEnd w:id="14"/>
+          <w:bookmarkEnd w:id="15"/>
+          <w:bookmarkEnd w:id="16"/>
+          <w:bookmarkEnd w:id="17"/>
+          <w:bookmarkEnd w:id="18"/>
+          <w:bookmarkEnd w:id="19"/>
+          <w:bookmarkEnd w:id="20"/>
+          <w:bookmarkEnd w:id="21"/>
+          <w:bookmarkEnd w:id="22"/>
           <w:bookmarkEnd w:id="25"/>
-          <w:bookmarkEnd w:id="26"/>
-          <w:bookmarkEnd w:id="27"/>
           <w:p>
             <w:pPr>
               <w:rPr>
@@ -4918,7 +4288,7 @@
               </w:rPr>
               <w:t> </w:t>
             </w:r>
-            <w:bookmarkStart w:id="28" w:name="OLE_LINK15"/>
+            <w:bookmarkStart w:id="26" w:name="OLE_LINK15"/>
             <w:bookmarkEnd w:id="6"/>
             <w:bookmarkEnd w:id="11"/>
             <w:bookmarkEnd w:id="12"/>
@@ -4927,326 +4297,106 @@
           <w:p>
             <w:pPr>
               <w:pStyle w:val="NormalWeb"/>
-              <w:spacing w:after="240" w:afterAutospacing="0"/>
-              <w:rPr>
-                <w:rFonts w:ascii="Aptos" w:hAnsi="Aptos" w:cs="Segoe UI"/>
-                <w:color w:val="000000" w:themeColor="text1"/>
-                <w:sz w:val="22"/>
-                <w:szCs w:val="22"/>
-                <w:shd w:val="clear" w:color="auto" w:fill="FFFFFF"/>
-              </w:rPr>
-            </w:pPr>
-            <w:bookmarkStart w:id="29" w:name="OLE_LINK22"/>
-            <w:bookmarkStart w:id="30" w:name="OLE_LINK20"/>
-            <w:bookmarkStart w:id="31" w:name="OLE_LINK33"/>
-            <w:r>
-              <w:rPr>
-                <w:rFonts w:ascii="Aptos" w:hAnsi="Aptos" w:cs="Segoe UI"/>
-                <w:color w:val="000000" w:themeColor="text1"/>
+              <w:spacing w:before="0" w:after="0" w:afterAutospacing="0"/>
+              <w:rPr>
+                <w:rFonts w:ascii="Aptos" w:hAnsi="Aptos"/>
+                <w:color w:val="000000"/>
+                <w:sz w:val="22"/>
+                <w:szCs w:val="22"/>
+              </w:rPr>
+            </w:pPr>
+            <w:bookmarkStart w:id="27" w:name="OLE_LINK22"/>
+            <w:bookmarkStart w:id="28" w:name="OLE_LINK20"/>
+            <w:bookmarkStart w:id="29" w:name="OLE_LINK33"/>
+            <w:r>
+              <w:rPr>
+                <w:rFonts w:ascii="Aptos" w:hAnsi="Aptos"/>
+                <w:color w:val="000000"/>
                 <w:sz w:val="22"/>
                 <w:szCs w:val="22"/>
                 <w:u w:val="single"/>
                 <w:shd w:val="clear" w:color="auto" w:fill="FFFFFF"/>
               </w:rPr>
-              <w:t>HPCDATAMGM-</w:t>
-            </w:r>
-            <w:r>
-              <w:rPr>
-                <w:rFonts w:ascii="Aptos" w:hAnsi="Aptos" w:cs="Segoe UI"/>
-                <w:color w:val="000000" w:themeColor="text1"/>
+              <w:t>HPCDATAMGM-2208, 2212</w:t>
+            </w:r>
+            <w:r>
+              <w:rPr>
+                <w:rFonts w:ascii="Aptos" w:hAnsi="Aptos"/>
+                <w:color w:val="000000"/>
+                <w:sz w:val="22"/>
+                <w:szCs w:val="22"/>
+                <w:shd w:val="clear" w:color="auto" w:fill="FFFFFF"/>
+              </w:rPr>
+              <w:t>: </w:t>
+            </w:r>
+            <w:r>
+              <w:rPr>
+                <w:rStyle w:val="apple-converted-space"/>
+                <w:rFonts w:ascii="Aptos" w:hAnsi="Aptos"/>
+                <w:color w:val="000000"/>
+                <w:sz w:val="22"/>
+                <w:szCs w:val="22"/>
+                <w:shd w:val="clear" w:color="auto" w:fill="FFFFFF"/>
+              </w:rPr>
+              <w:t> </w:t>
+            </w:r>
+            <w:r>
+              <w:rPr>
+                <w:rFonts w:ascii="Aptos" w:hAnsi="Aptos"/>
+                <w:color w:val="000000"/>
+                <w:sz w:val="22"/>
+                <w:szCs w:val="22"/>
+                <w:shd w:val="clear" w:color="auto" w:fill="FFFFFF"/>
+              </w:rPr>
+              <w:t>Set up a scheduled task in DME to migrate files archived before a configured date from VAST to Glacier.  This configuration is custom to each user group.</w:t>
+            </w:r>
+          </w:p>
+          <w:p>
+            <w:pPr>
+              <w:spacing w:before="100" w:beforeAutospacing="1" w:after="100" w:afterAutospacing="1"/>
+              <w:rPr>
+                <w:rFonts w:ascii="Aptos" w:hAnsi="Aptos"/>
+                <w:color w:val="000000"/>
+                <w:sz w:val="22"/>
+                <w:szCs w:val="22"/>
+                <w:shd w:val="clear" w:color="auto" w:fill="FFFFFF"/>
+              </w:rPr>
+            </w:pPr>
+            <w:r>
+              <w:rPr>
+                <w:rFonts w:ascii="Aptos" w:hAnsi="Aptos"/>
+                <w:color w:val="000000"/>
                 <w:sz w:val="22"/>
                 <w:szCs w:val="22"/>
                 <w:u w:val="single"/>
                 <w:shd w:val="clear" w:color="auto" w:fill="FFFFFF"/>
               </w:rPr>
-              <w:t xml:space="preserve">2208, </w:t>
-            </w:r>
-            <w:r>
-              <w:rPr>
-                <w:rFonts w:ascii="Aptos" w:hAnsi="Aptos" w:cs="Segoe UI"/>
-                <w:color w:val="000000" w:themeColor="text1"/>
-                <w:sz w:val="22"/>
-                <w:szCs w:val="22"/>
-                <w:u w:val="single"/>
+              <w:t>HPCDATAMGM-2210, 2207, 2209</w:t>
+            </w:r>
+            <w:r>
+              <w:rPr>
+                <w:rFonts w:ascii="Aptos" w:hAnsi="Aptos"/>
+                <w:color w:val="000000"/>
+                <w:sz w:val="22"/>
+                <w:szCs w:val="22"/>
                 <w:shd w:val="clear" w:color="auto" w:fill="FFFFFF"/>
               </w:rPr>
-              <w:t>2</w:t>
-            </w:r>
-            <w:r>
-              <w:rPr>
-                <w:rFonts w:ascii="Aptos" w:hAnsi="Aptos" w:cs="Segoe UI"/>
-                <w:color w:val="000000" w:themeColor="text1"/>
-                <w:sz w:val="22"/>
-                <w:szCs w:val="22"/>
-                <w:u w:val="single"/>
-                <w:shd w:val="clear" w:color="auto" w:fill="FFFFFF"/>
-              </w:rPr>
-              <w:t>212</w:t>
-            </w:r>
-            <w:r>
-              <w:rPr>
-                <w:rFonts w:ascii="Aptos" w:hAnsi="Aptos" w:cs="Segoe UI"/>
-                <w:color w:val="000000" w:themeColor="text1"/>
-                <w:sz w:val="22"/>
-                <w:szCs w:val="22"/>
-                <w:shd w:val="clear" w:color="auto" w:fill="FFFFFF"/>
-              </w:rPr>
-              <w:t xml:space="preserve">: </w:t>
-            </w:r>
-            <w:r>
-              <w:rPr>
-                <w:rFonts w:ascii="Aptos" w:hAnsi="Aptos" w:cs="Segoe UI"/>
-                <w:color w:val="000000" w:themeColor="text1"/>
-                <w:sz w:val="22"/>
-                <w:szCs w:val="22"/>
-                <w:shd w:val="clear" w:color="auto" w:fill="FFFFFF"/>
-              </w:rPr>
-              <w:t xml:space="preserve"> </w:t>
-            </w:r>
-            <w:bookmarkStart w:id="32" w:name="OLE_LINK117"/>
-            <w:bookmarkStart w:id="33" w:name="OLE_LINK24"/>
-            <w:r>
-              <w:rPr>
-                <w:rFonts w:ascii="Aptos" w:hAnsi="Aptos" w:cs="Segoe UI"/>
-                <w:color w:val="000000" w:themeColor="text1"/>
-                <w:sz w:val="22"/>
-                <w:szCs w:val="22"/>
-                <w:shd w:val="clear" w:color="auto" w:fill="FFFFFF"/>
-              </w:rPr>
-              <w:t>Set</w:t>
-            </w:r>
-            <w:r>
-              <w:rPr>
-                <w:rFonts w:ascii="Aptos" w:hAnsi="Aptos" w:cs="Segoe UI"/>
-                <w:color w:val="000000" w:themeColor="text1"/>
-                <w:sz w:val="22"/>
-                <w:szCs w:val="22"/>
-                <w:shd w:val="clear" w:color="auto" w:fill="FFFFFF"/>
-              </w:rPr>
-              <w:t xml:space="preserve"> </w:t>
-            </w:r>
-            <w:r>
-              <w:rPr>
-                <w:rFonts w:ascii="Aptos" w:hAnsi="Aptos" w:cs="Segoe UI"/>
-                <w:color w:val="000000" w:themeColor="text1"/>
-                <w:sz w:val="22"/>
-                <w:szCs w:val="22"/>
-                <w:shd w:val="clear" w:color="auto" w:fill="FFFFFF"/>
-              </w:rPr>
-              <w:t xml:space="preserve">up a scheduled task to migrate files </w:t>
-            </w:r>
-            <w:r>
-              <w:rPr>
-                <w:rFonts w:ascii="Aptos" w:hAnsi="Aptos" w:cs="Segoe UI"/>
-                <w:color w:val="000000" w:themeColor="text1"/>
-                <w:sz w:val="22"/>
-                <w:szCs w:val="22"/>
-                <w:shd w:val="clear" w:color="auto" w:fill="FFFFFF"/>
-              </w:rPr>
-              <w:t>archived</w:t>
-            </w:r>
-            <w:r>
-              <w:rPr>
-                <w:rFonts w:ascii="Aptos" w:hAnsi="Aptos" w:cs="Segoe UI"/>
-                <w:color w:val="000000" w:themeColor="text1"/>
-                <w:sz w:val="22"/>
-                <w:szCs w:val="22"/>
-                <w:shd w:val="clear" w:color="auto" w:fill="FFFFFF"/>
-              </w:rPr>
-              <w:t xml:space="preserve"> before</w:t>
-            </w:r>
-            <w:r>
-              <w:rPr>
-                <w:rFonts w:ascii="Aptos" w:hAnsi="Aptos" w:cs="Segoe UI"/>
-                <w:color w:val="000000" w:themeColor="text1"/>
-                <w:sz w:val="22"/>
-                <w:szCs w:val="22"/>
-                <w:shd w:val="clear" w:color="auto" w:fill="FFFFFF"/>
-              </w:rPr>
-              <w:t xml:space="preserve"> a configured </w:t>
-            </w:r>
-            <w:r>
-              <w:rPr>
-                <w:rFonts w:ascii="Aptos" w:hAnsi="Aptos" w:cs="Segoe UI"/>
-                <w:color w:val="000000" w:themeColor="text1"/>
-                <w:sz w:val="22"/>
-                <w:szCs w:val="22"/>
-                <w:shd w:val="clear" w:color="auto" w:fill="FFFFFF"/>
-              </w:rPr>
-              <w:t>date in DME</w:t>
-            </w:r>
-            <w:r>
-              <w:rPr>
-                <w:rFonts w:ascii="Aptos" w:hAnsi="Aptos" w:cs="Segoe UI"/>
-                <w:color w:val="000000" w:themeColor="text1"/>
-                <w:sz w:val="22"/>
-                <w:szCs w:val="22"/>
-                <w:shd w:val="clear" w:color="auto" w:fill="FFFFFF"/>
-              </w:rPr>
-              <w:t xml:space="preserve"> from VAST to Glacier</w:t>
-            </w:r>
-            <w:r>
-              <w:rPr>
-                <w:rFonts w:ascii="Aptos" w:hAnsi="Aptos" w:cs="Segoe UI"/>
-                <w:color w:val="000000" w:themeColor="text1"/>
-                <w:sz w:val="22"/>
-                <w:szCs w:val="22"/>
-                <w:shd w:val="clear" w:color="auto" w:fill="FFFFFF"/>
-              </w:rPr>
-              <w:t>.</w:t>
-            </w:r>
-            <w:r>
-              <w:rPr>
-                <w:rFonts w:ascii="Aptos" w:hAnsi="Aptos" w:cs="Segoe UI"/>
-                <w:color w:val="000000" w:themeColor="text1"/>
-                <w:sz w:val="22"/>
-                <w:szCs w:val="22"/>
-                <w:shd w:val="clear" w:color="auto" w:fill="FFFFFF"/>
-              </w:rPr>
-              <w:t xml:space="preserve">  This configuration </w:t>
-            </w:r>
-            <w:r>
-              <w:rPr>
-                <w:rFonts w:ascii="Aptos" w:hAnsi="Aptos" w:cs="Segoe UI"/>
-                <w:color w:val="000000" w:themeColor="text1"/>
-                <w:sz w:val="22"/>
-                <w:szCs w:val="22"/>
-                <w:shd w:val="clear" w:color="auto" w:fill="FFFFFF"/>
-              </w:rPr>
-              <w:t>is</w:t>
-            </w:r>
-            <w:r>
-              <w:rPr>
-                <w:rFonts w:ascii="Aptos" w:hAnsi="Aptos" w:cs="Segoe UI"/>
-                <w:color w:val="000000" w:themeColor="text1"/>
-                <w:sz w:val="22"/>
-                <w:szCs w:val="22"/>
-                <w:shd w:val="clear" w:color="auto" w:fill="FFFFFF"/>
-              </w:rPr>
-              <w:t xml:space="preserve"> </w:t>
-            </w:r>
-            <w:r>
-              <w:rPr>
-                <w:rFonts w:ascii="Aptos" w:hAnsi="Aptos" w:cs="Segoe UI"/>
-                <w:color w:val="000000" w:themeColor="text1"/>
-                <w:sz w:val="22"/>
-                <w:szCs w:val="22"/>
-                <w:shd w:val="clear" w:color="auto" w:fill="FFFFFF"/>
-              </w:rPr>
-              <w:t>custom</w:t>
-            </w:r>
-            <w:r>
-              <w:rPr>
-                <w:rFonts w:ascii="Aptos" w:hAnsi="Aptos" w:cs="Segoe UI"/>
-                <w:color w:val="000000" w:themeColor="text1"/>
-                <w:sz w:val="22"/>
-                <w:szCs w:val="22"/>
-                <w:shd w:val="clear" w:color="auto" w:fill="FFFFFF"/>
-              </w:rPr>
-              <w:t xml:space="preserve"> to each </w:t>
-            </w:r>
-            <w:r>
-              <w:rPr>
-                <w:rFonts w:ascii="Aptos" w:hAnsi="Aptos" w:cs="Segoe UI"/>
-                <w:color w:val="000000" w:themeColor="text1"/>
-                <w:sz w:val="22"/>
-                <w:szCs w:val="22"/>
-                <w:shd w:val="clear" w:color="auto" w:fill="FFFFFF"/>
-              </w:rPr>
-              <w:t>user g</w:t>
-            </w:r>
-            <w:r>
-              <w:rPr>
-                <w:rFonts w:ascii="Aptos" w:hAnsi="Aptos" w:cs="Segoe UI"/>
-                <w:color w:val="000000" w:themeColor="text1"/>
-                <w:sz w:val="22"/>
-                <w:szCs w:val="22"/>
-                <w:shd w:val="clear" w:color="auto" w:fill="FFFFFF"/>
-              </w:rPr>
-              <w:t>roup</w:t>
+              <w:t>: Upgraded the Apache, Jackson, and Spring framework libraries used in the DME API server to remediate security vulnerabilities flagged by the Nessus scan.</w:t>
             </w:r>
             <w:bookmarkEnd w:id="1"/>
             <w:bookmarkEnd w:id="7"/>
             <w:bookmarkEnd w:id="24"/>
+            <w:bookmarkEnd w:id="26"/>
+            <w:bookmarkEnd w:id="27"/>
             <w:bookmarkEnd w:id="28"/>
             <w:bookmarkEnd w:id="29"/>
-            <w:bookmarkEnd w:id="30"/>
-            <w:bookmarkEnd w:id="32"/>
-            <w:r>
-              <w:rPr>
-                <w:rFonts w:ascii="Aptos" w:hAnsi="Aptos" w:cs="Segoe UI"/>
-                <w:color w:val="000000" w:themeColor="text1"/>
-                <w:sz w:val="22"/>
-                <w:szCs w:val="22"/>
-                <w:shd w:val="clear" w:color="auto" w:fill="FFFFFF"/>
-              </w:rPr>
-              <w:t xml:space="preserve">. </w:t>
-            </w:r>
-            <w:bookmarkEnd w:id="33"/>
-          </w:p>
-          <w:p>
-            <w:pPr>
-              <w:pStyle w:val="paragraph"/>
-              <w:spacing w:before="120" w:beforeAutospacing="0"/>
-              <w:textAlignment w:val="baseline"/>
-              <w:rPr>
-                <w:rFonts w:ascii="Aptos" w:hAnsi="Aptos" w:cs="Segoe UI"/>
-                <w:color w:val="000000" w:themeColor="text1"/>
-                <w:sz w:val="22"/>
-                <w:szCs w:val="22"/>
-                <w:shd w:val="clear" w:color="auto" w:fill="FFFFFF"/>
-              </w:rPr>
-            </w:pPr>
-            <w:r>
-              <w:rPr>
-                <w:rFonts w:ascii="Aptos" w:hAnsi="Aptos" w:cs="Segoe UI"/>
-                <w:color w:val="000000" w:themeColor="text1"/>
-                <w:sz w:val="22"/>
-                <w:szCs w:val="22"/>
-                <w:u w:val="single"/>
-                <w:shd w:val="clear" w:color="auto" w:fill="FFFFFF"/>
-              </w:rPr>
-              <w:t>HPCDATAMGM-2210, 2207, 2209</w:t>
-            </w:r>
-            <w:r>
-              <w:rPr>
-                <w:rFonts w:ascii="Aptos" w:hAnsi="Aptos" w:cs="Segoe UI"/>
-                <w:color w:val="000000" w:themeColor="text1"/>
-                <w:sz w:val="22"/>
-                <w:szCs w:val="22"/>
-                <w:shd w:val="clear" w:color="auto" w:fill="FFFFFF"/>
-              </w:rPr>
-              <w:t>: Upgrade the Apache, Jackson</w:t>
-            </w:r>
-            <w:r>
-              <w:rPr>
-                <w:rFonts w:ascii="Aptos" w:hAnsi="Aptos" w:cs="Segoe UI"/>
-                <w:color w:val="000000" w:themeColor="text1"/>
-                <w:sz w:val="22"/>
-                <w:szCs w:val="22"/>
-                <w:shd w:val="clear" w:color="auto" w:fill="FFFFFF"/>
-              </w:rPr>
-              <w:t>,</w:t>
-            </w:r>
-            <w:r>
-              <w:rPr>
-                <w:rFonts w:ascii="Aptos" w:hAnsi="Aptos" w:cs="Segoe UI"/>
-                <w:color w:val="000000" w:themeColor="text1"/>
-                <w:sz w:val="22"/>
-                <w:szCs w:val="22"/>
-                <w:shd w:val="clear" w:color="auto" w:fill="FFFFFF"/>
-              </w:rPr>
-              <w:t xml:space="preserve"> and Spring framework libraries used in the DME API server to remediate security vulnerabilities flagged by the Nessus scan.</w:t>
-            </w:r>
-            <w:bookmarkEnd w:id="31"/>
-          </w:p>
-          <w:p>
-            <w:pPr>
-              <w:pStyle w:val="paragraph"/>
-              <w:spacing w:before="120" w:beforeAutospacing="0"/>
-              <w:textAlignment w:val="baseline"/>
-              <w:rPr>
-                <w:rFonts w:ascii="Aptos" w:hAnsi="Aptos" w:cstheme="minorHAnsi"/>
+          </w:p>
+          <w:p>
+            <w:pPr>
+              <w:spacing w:before="100" w:beforeAutospacing="1" w:after="100" w:afterAutospacing="1"/>
+              <w:rPr>
+                <w:rFonts w:ascii="Aptos" w:hAnsi="Aptos"/>
+                <w:color w:val="000000"/>
                 <w:sz w:val="22"/>
                 <w:szCs w:val="22"/>
               </w:rPr>
@@ -5279,10 +4429,10 @@
                 <w:szCs w:val="22"/>
               </w:rPr>
             </w:pPr>
-            <w:bookmarkStart w:id="34" w:name="OLE_LINK2"/>
-            <w:bookmarkStart w:id="35" w:name="OLE_LINK5"/>
-          </w:p>
-          <w:bookmarkEnd w:id="34"/>
+            <w:bookmarkStart w:id="30" w:name="OLE_LINK2"/>
+            <w:bookmarkStart w:id="31" w:name="OLE_LINK5"/>
+          </w:p>
+          <w:bookmarkEnd w:id="30"/>
           <w:p>
             <w:pPr>
               <w:pStyle w:val="ListParagraph"/>
@@ -5560,7 +4710,7 @@
                 <w:sz w:val="22"/>
                 <w:szCs w:val="22"/>
               </w:rPr>
-              <w:t xml:space="preserve"> 3.28</w:t>
+              <w:t xml:space="preserve"> 3.2</w:t>
             </w:r>
             <w:r>
               <w:rPr>
@@ -5569,7 +4719,7 @@
                 <w:sz w:val="22"/>
                 <w:szCs w:val="22"/>
               </w:rPr>
-              <w:t xml:space="preserve">. </w:t>
+              <w:t>7</w:t>
             </w:r>
             <w:r>
               <w:rPr>
@@ -5578,7 +4728,52 @@
                 <w:sz w:val="22"/>
                 <w:szCs w:val="22"/>
               </w:rPr>
-              <w:t>To obtain the new public key, u</w:t>
+              <w:t>.</w:t>
+            </w:r>
+            <w:r>
+              <w:rPr>
+                <w:rFonts w:ascii="Aptos" w:hAnsi="Aptos"/>
+                <w:color w:val="000000"/>
+                <w:sz w:val="22"/>
+                <w:szCs w:val="22"/>
+              </w:rPr>
+              <w:t>0.</w:t>
+            </w:r>
+            <w:r>
+              <w:rPr>
+                <w:rFonts w:ascii="Aptos" w:hAnsi="Aptos"/>
+                <w:color w:val="000000"/>
+                <w:sz w:val="22"/>
+                <w:szCs w:val="22"/>
+              </w:rPr>
+              <w:t xml:space="preserve"> </w:t>
+            </w:r>
+            <w:r>
+              <w:rPr>
+                <w:rFonts w:ascii="Aptos" w:hAnsi="Aptos"/>
+                <w:color w:val="000000"/>
+                <w:sz w:val="22"/>
+                <w:szCs w:val="22"/>
+              </w:rPr>
+              <w:t xml:space="preserve">To obtain the </w:t>
+            </w:r>
+            <w:r>
+              <w:rPr>
+                <w:rFonts w:ascii="Aptos" w:hAnsi="Aptos"/>
+                <w:color w:val="000000"/>
+                <w:sz w:val="22"/>
+                <w:szCs w:val="22"/>
+              </w:rPr>
+              <w:t>new</w:t>
+            </w:r>
+            <w:r>
+              <w:rPr>
+                <w:rFonts w:ascii="Aptos" w:hAnsi="Aptos"/>
+                <w:color w:val="000000"/>
+                <w:sz w:val="22"/>
+                <w:szCs w:val="22"/>
+              </w:rPr>
+              <w:t xml:space="preserve"> public key, u</w:t>
             </w:r>
             <w:r>
               <w:rPr>
@@ -5658,9 +4853,9 @@
             <w:bookmarkEnd w:id="3"/>
             <w:bookmarkEnd w:id="9"/>
             <w:bookmarkEnd w:id="10"/>
-            <w:bookmarkEnd w:id="35"/>
-          </w:p>
-          <w:bookmarkEnd w:id="5"/>
+            <w:bookmarkEnd w:id="31"/>
+          </w:p>
+          <w:bookmarkEnd w:id="4"/>
           <w:p>
             <w:pPr>
               <w:pStyle w:val="ListParagraph"/>
@@ -6117,7 +5312,7 @@
               <w:t>.</w:t>
             </w:r>
           </w:p>
-          <w:bookmarkEnd w:id="4"/>
+          <w:bookmarkEnd w:id="5"/>
           <w:p>
             <w:pPr>
               <w:rPr>
@@ -6205,6 +5400,155 @@
 <file path=word/numbering.xml><?xml version="1.0" encoding="utf-8"?>
 <w:numbering xmlns:wpc="http://schemas.microsoft.com/office/word/2010/wordprocessingCanvas" xmlns:cx="http://schemas.microsoft.com/office/drawing/2014/chartex" xmlns:cx1="http://schemas.microsoft.com/office/drawing/2015/9/8/chartex" xmlns:cx2="http://schemas.microsoft.com/office/drawing/2015/10/21/chartex" xmlns:cx3="http://schemas.microsoft.com/office/drawing/2016/5/9/chartex" xmlns:cx4="http://schemas.microsoft.com/office/drawing/2016/5/10/chartex" xmlns:cx5="http://schemas.microsoft.com/office/drawing/2016/5/11/chartex" xmlns:cx6="http://schemas.microsoft.com/office/drawing/2016/5/12/chartex" xmlns:cx7="http://schemas.microsoft.com/office/drawing/2016/5/13/chartex" xmlns:cx8="http://schemas.microsoft.com/office/drawing/2016/5/14/chartex" xmlns:mc="http://schemas.openxmlformats.org/markup-compatibility/2006" xmlns:m="http://schemas.openxmlformats.org/officeDocument/2006/math" xmlns:aink="http://schemas.microsoft.com/office/drawing/2016/ink" xmlns:am3d="http://schemas.microsoft.com/office/drawing/2017/model3d" xmlns:oel="http://schemas.microsoft.com/office/2019/extlst" xmlns:r="http://schemas.openxmlformats.org/officeDocument/2006/relationships" xmlns:wp14="http://schemas.microsoft.com/office/word/2010/wordprocessingDrawing" xmlns:wp="http://schemas.openxmlformats.org/drawingml/2006/wordprocessingDrawing" xmlns:wpg="http://schemas.microsoft.com/office/word/2010/wordprocessingGroup" xmlns:wpi="http://schemas.microsoft.com/office/word/2010/wordprocessingInk" xmlns:wps="http://schemas.microsoft.com/office/word/2010/wordprocessingShape" xmlns:o="urn:schemas-microsoft-com:office:office" xmlns:v="urn:schemas-microsoft-com:vml" xmlns:w10="urn:schemas-microsoft-com:office:word" xmlns:w="http://schemas.openxmlformats.org/wordprocessingml/2006/main" xmlns:w14="http://schemas.microsoft.com/office/word/2010/wordml" xmlns:w15="http://schemas.microsoft.com/office/word/2012/wordml" xmlns:w16cei="http://schemas.microsoft.com/office/word/2026/wordml/cei" xmlns:w16cex="http://schemas.microsoft.com/office/word/2018/wordml/cex" xmlns:w16cid="http://schemas.microsoft.com/office/word/2016/wordml/cid" xmlns:w16="http://schemas.microsoft.com/office/word/2018/wordml" xmlns:w16sdtdh="http://schemas.microsoft.com/office/word/2020/wordml/sdtdatahash" xmlns:w16sdtfl="http://schemas.microsoft.com/office/word/2024/wordml/sdtformatlock" xmlns:w16se="http://schemas.microsoft.com/office/word/2015/wordml/symex" xmlns:w16du="http://schemas.microsoft.com/office/word/2023/wordml/word16du" xmlns:wne="http://schemas.microsoft.com/office/word/2006/wordml" mc:Ignorable="w14 w15 w16se w16cid w16 w16cex w16sdtdh w16sdtfl w16du wp14">
   <w:abstractNum w:abstractNumId="0" w15:restartNumberingAfterBreak="0">
+    <w:nsid w:val="160B5EC1"/>
+    <w:multiLevelType w:val="multilevel"/>
+    <w:tmpl w:val="C86A3BEC"/>
+    <w:lvl w:ilvl="0">
+      <w:start w:val="1"/>
+      <w:numFmt w:val="bullet"/>
+      <w:lvlText w:val=""/>
+      <w:lvlJc w:val="left"/>
+      <w:pPr>
+        <w:tabs>
+          <w:tab w:val="num" w:pos="720"/>
+        </w:tabs>
+        <w:ind w:left="720" w:hanging="360"/>
+      </w:pPr>
+      <w:rPr>
+        <w:rFonts w:ascii="Symbol" w:hAnsi="Symbol" w:hint="default"/>
+        <w:sz w:val="20"/>
+      </w:rPr>
+    </w:lvl>
+    <w:lvl w:ilvl="1" w:tentative="1">
+      <w:start w:val="1"/>
+      <w:numFmt w:val="bullet"/>
+      <w:lvlText w:val=""/>
+      <w:lvlJc w:val="left"/>
+      <w:pPr>
+        <w:tabs>
+          <w:tab w:val="num" w:pos="1440"/>
+        </w:tabs>
+        <w:ind w:left="1440" w:hanging="360"/>
+      </w:pPr>
+      <w:rPr>
+        <w:rFonts w:ascii="Symbol" w:hAnsi="Symbol" w:hint="default"/>
+        <w:sz w:val="20"/>
+      </w:rPr>
+    </w:lvl>
+    <w:lvl w:ilvl="2" w:tentative="1">
+      <w:start w:val="1"/>
+      <w:numFmt w:val="bullet"/>
+      <w:lvlText w:val=""/>
+      <w:lvlJc w:val="left"/>
+      <w:pPr>
+        <w:tabs>
+          <w:tab w:val="num" w:pos="2160"/>
+        </w:tabs>
+        <w:ind w:left="2160" w:hanging="360"/>
+      </w:pPr>
+      <w:rPr>
+        <w:rFonts w:ascii="Symbol" w:hAnsi="Symbol" w:hint="default"/>
+        <w:sz w:val="20"/>
+      </w:rPr>
+    </w:lvl>
+    <w:lvl w:ilvl="3" w:tentative="1">
+      <w:start w:val="1"/>
+      <w:numFmt w:val="bullet"/>
+      <w:lvlText w:val=""/>
+      <w:lvlJc w:val="left"/>
+      <w:pPr>
+        <w:tabs>
+          <w:tab w:val="num" w:pos="2880"/>
+        </w:tabs>
+        <w:ind w:left="2880" w:hanging="360"/>
+      </w:pPr>
+      <w:rPr>
+        <w:rFonts w:ascii="Symbol" w:hAnsi="Symbol" w:hint="default"/>
+        <w:sz w:val="20"/>
+      </w:rPr>
+    </w:lvl>
+    <w:lvl w:ilvl="4" w:tentative="1">
+      <w:start w:val="1"/>
+      <w:numFmt w:val="bullet"/>
+      <w:lvlText w:val=""/>
+      <w:lvlJc w:val="left"/>
+      <w:pPr>
+        <w:tabs>
+          <w:tab w:val="num" w:pos="3600"/>
+        </w:tabs>
+        <w:ind w:left="3600" w:hanging="360"/>
+      </w:pPr>
+      <w:rPr>
+        <w:rFonts w:ascii="Symbol" w:hAnsi="Symbol" w:hint="default"/>
+        <w:sz w:val="20"/>
+      </w:rPr>
+    </w:lvl>
+    <w:lvl w:ilvl="5" w:tentative="1">
+      <w:start w:val="1"/>
+      <w:numFmt w:val="bullet"/>
+      <w:lvlText w:val=""/>
+      <w:lvlJc w:val="left"/>
+      <w:pPr>
+        <w:tabs>
+          <w:tab w:val="num" w:pos="4320"/>
+        </w:tabs>
+        <w:ind w:left="4320" w:hanging="360"/>
+      </w:pPr>
+      <w:rPr>
+        <w:rFonts w:ascii="Symbol" w:hAnsi="Symbol" w:hint="default"/>
+        <w:sz w:val="20"/>
+      </w:rPr>
+    </w:lvl>
+    <w:lvl w:ilvl="6" w:tentative="1">
+      <w:start w:val="1"/>
+      <w:numFmt w:val="bullet"/>
+      <w:lvlText w:val=""/>
+      <w:lvlJc w:val="left"/>
+      <w:pPr>
+        <w:tabs>
+          <w:tab w:val="num" w:pos="5040"/>
+        </w:tabs>
+        <w:ind w:left="5040" w:hanging="360"/>
+      </w:pPr>
+      <w:rPr>
+        <w:rFonts w:ascii="Symbol" w:hAnsi="Symbol" w:hint="default"/>
+        <w:sz w:val="20"/>
+      </w:rPr>
+    </w:lvl>
+    <w:lvl w:ilvl="7" w:tentative="1">
+      <w:start w:val="1"/>
+      <w:numFmt w:val="bullet"/>
+      <w:lvlText w:val=""/>
+      <w:lvlJc w:val="left"/>
+      <w:pPr>
+        <w:tabs>
+          <w:tab w:val="num" w:pos="5760"/>
+        </w:tabs>
+        <w:ind w:left="5760" w:hanging="360"/>
+      </w:pPr>
+      <w:rPr>
+        <w:rFonts w:ascii="Symbol" w:hAnsi="Symbol" w:hint="default"/>
+        <w:sz w:val="20"/>
+      </w:rPr>
+    </w:lvl>
+    <w:lvl w:ilvl="8" w:tentative="1">
+      <w:start w:val="1"/>
+      <w:numFmt w:val="bullet"/>
+      <w:lvlText w:val=""/>
+      <w:lvlJc w:val="left"/>
+      <w:pPr>
+        <w:tabs>
+          <w:tab w:val="num" w:pos="6480"/>
+        </w:tabs>
+        <w:ind w:left="6480" w:hanging="360"/>
+      </w:pPr>
+      <w:rPr>
+        <w:rFonts w:ascii="Symbol" w:hAnsi="Symbol" w:hint="default"/>
+        <w:sz w:val="20"/>
+      </w:rPr>
+    </w:lvl>
+  </w:abstractNum>
+  <w:abstractNum w:abstractNumId="1" w15:restartNumberingAfterBreak="0">
     <w:nsid w:val="1ABA0956"/>
     <w:multiLevelType w:val="multilevel"/>
     <w:tmpl w:val="3D74FCF6"/>
@@ -6290,7 +5634,7 @@
       </w:pPr>
     </w:lvl>
   </w:abstractNum>
-  <w:abstractNum w:abstractNumId="1" w15:restartNumberingAfterBreak="0">
+  <w:abstractNum w:abstractNumId="2" w15:restartNumberingAfterBreak="0">
     <w:nsid w:val="1C1C250B"/>
     <w:multiLevelType w:val="hybridMultilevel"/>
     <w:tmpl w:val="7BA4D800"/>
@@ -6403,7 +5747,7 @@
       </w:rPr>
     </w:lvl>
   </w:abstractNum>
-  <w:abstractNum w:abstractNumId="2" w15:restartNumberingAfterBreak="0">
+  <w:abstractNum w:abstractNumId="3" w15:restartNumberingAfterBreak="0">
     <w:nsid w:val="2A2F136B"/>
     <w:multiLevelType w:val="hybridMultilevel"/>
     <w:tmpl w:val="51EEA816"/>
@@ -6516,7 +5860,7 @@
       </w:rPr>
     </w:lvl>
   </w:abstractNum>
-  <w:abstractNum w:abstractNumId="3" w15:restartNumberingAfterBreak="0">
+  <w:abstractNum w:abstractNumId="4" w15:restartNumberingAfterBreak="0">
     <w:nsid w:val="30207165"/>
     <w:multiLevelType w:val="multilevel"/>
     <w:tmpl w:val="E94CB54E"/>
@@ -6629,7 +5973,7 @@
       </w:rPr>
     </w:lvl>
   </w:abstractNum>
-  <w:abstractNum w:abstractNumId="4" w15:restartNumberingAfterBreak="0">
+  <w:abstractNum w:abstractNumId="5" w15:restartNumberingAfterBreak="0">
     <w:nsid w:val="45AA48D5"/>
     <w:multiLevelType w:val="multilevel"/>
     <w:tmpl w:val="E94CB54E"/>
@@ -6742,7 +6086,7 @@
       </w:rPr>
     </w:lvl>
   </w:abstractNum>
-  <w:abstractNum w:abstractNumId="5" w15:restartNumberingAfterBreak="0">
+  <w:abstractNum w:abstractNumId="6" w15:restartNumberingAfterBreak="0">
     <w:nsid w:val="509942C0"/>
     <w:multiLevelType w:val="multilevel"/>
     <w:tmpl w:val="0409001D"/>
@@ -6855,7 +6199,7 @@
       </w:rPr>
     </w:lvl>
   </w:abstractNum>
-  <w:abstractNum w:abstractNumId="6" w15:restartNumberingAfterBreak="0">
+  <w:abstractNum w:abstractNumId="7" w15:restartNumberingAfterBreak="0">
     <w:nsid w:val="5428493F"/>
     <w:multiLevelType w:val="multilevel"/>
     <w:tmpl w:val="7E7AB37A"/>
@@ -7001,7 +6345,7 @@
       </w:rPr>
     </w:lvl>
   </w:abstractNum>
-  <w:abstractNum w:abstractNumId="7" w15:restartNumberingAfterBreak="0">
+  <w:abstractNum w:abstractNumId="8" w15:restartNumberingAfterBreak="0">
     <w:nsid w:val="5EAF2E6B"/>
     <w:multiLevelType w:val="multilevel"/>
     <w:tmpl w:val="E94CB54E"/>
@@ -7114,7 +6458,156 @@
       </w:rPr>
     </w:lvl>
   </w:abstractNum>
-  <w:abstractNum w:abstractNumId="8" w15:restartNumberingAfterBreak="0">
+  <w:abstractNum w:abstractNumId="9" w15:restartNumberingAfterBreak="0">
+    <w:nsid w:val="6C850068"/>
+    <w:multiLevelType w:val="multilevel"/>
+    <w:tmpl w:val="977C02EA"/>
+    <w:lvl w:ilvl="0">
+      <w:start w:val="1"/>
+      <w:numFmt w:val="bullet"/>
+      <w:lvlText w:val=""/>
+      <w:lvlJc w:val="left"/>
+      <w:pPr>
+        <w:tabs>
+          <w:tab w:val="num" w:pos="720"/>
+        </w:tabs>
+        <w:ind w:left="720" w:hanging="360"/>
+      </w:pPr>
+      <w:rPr>
+        <w:rFonts w:ascii="Symbol" w:hAnsi="Symbol" w:hint="default"/>
+        <w:sz w:val="20"/>
+      </w:rPr>
+    </w:lvl>
+    <w:lvl w:ilvl="1" w:tentative="1">
+      <w:start w:val="1"/>
+      <w:numFmt w:val="bullet"/>
+      <w:lvlText w:val=""/>
+      <w:lvlJc w:val="left"/>
+      <w:pPr>
+        <w:tabs>
+          <w:tab w:val="num" w:pos="1440"/>
+        </w:tabs>
+        <w:ind w:left="1440" w:hanging="360"/>
+      </w:pPr>
+      <w:rPr>
+        <w:rFonts w:ascii="Symbol" w:hAnsi="Symbol" w:hint="default"/>
+        <w:sz w:val="20"/>
+      </w:rPr>
+    </w:lvl>
+    <w:lvl w:ilvl="2" w:tentative="1">
+      <w:start w:val="1"/>
+      <w:numFmt w:val="bullet"/>
+      <w:lvlText w:val=""/>
+      <w:lvlJc w:val="left"/>
+      <w:pPr>
+        <w:tabs>
+          <w:tab w:val="num" w:pos="2160"/>
+        </w:tabs>
+        <w:ind w:left="2160" w:hanging="360"/>
+      </w:pPr>
+      <w:rPr>
+        <w:rFonts w:ascii="Symbol" w:hAnsi="Symbol" w:hint="default"/>
+        <w:sz w:val="20"/>
+      </w:rPr>
+    </w:lvl>
+    <w:lvl w:ilvl="3" w:tentative="1">
+      <w:start w:val="1"/>
+      <w:numFmt w:val="bullet"/>
+      <w:lvlText w:val=""/>
+      <w:lvlJc w:val="left"/>
+      <w:pPr>
+        <w:tabs>
+          <w:tab w:val="num" w:pos="2880"/>
+        </w:tabs>
+        <w:ind w:left="2880" w:hanging="360"/>
+      </w:pPr>
+      <w:rPr>
+        <w:rFonts w:ascii="Symbol" w:hAnsi="Symbol" w:hint="default"/>
+        <w:sz w:val="20"/>
+      </w:rPr>
+    </w:lvl>
+    <w:lvl w:ilvl="4" w:tentative="1">
+      <w:start w:val="1"/>
+      <w:numFmt w:val="bullet"/>
+      <w:lvlText w:val=""/>
+      <w:lvlJc w:val="left"/>
+      <w:pPr>
+        <w:tabs>
+          <w:tab w:val="num" w:pos="3600"/>
+        </w:tabs>
+        <w:ind w:left="3600" w:hanging="360"/>
+      </w:pPr>
+      <w:rPr>
+        <w:rFonts w:ascii="Symbol" w:hAnsi="Symbol" w:hint="default"/>
+        <w:sz w:val="20"/>
+      </w:rPr>
+    </w:lvl>
+    <w:lvl w:ilvl="5" w:tentative="1">
+      <w:start w:val="1"/>
+      <w:numFmt w:val="bullet"/>
+      <w:lvlText w:val=""/>
+      <w:lvlJc w:val="left"/>
+      <w:pPr>
+        <w:tabs>
+          <w:tab w:val="num" w:pos="4320"/>
+        </w:tabs>
+        <w:ind w:left="4320" w:hanging="360"/>
+      </w:pPr>
+      <w:rPr>
+        <w:rFonts w:ascii="Symbol" w:hAnsi="Symbol" w:hint="default"/>
+        <w:sz w:val="20"/>
+      </w:rPr>
+    </w:lvl>
+    <w:lvl w:ilvl="6" w:tentative="1">
+      <w:start w:val="1"/>
+      <w:numFmt w:val="bullet"/>
+      <w:lvlText w:val=""/>
+      <w:lvlJc w:val="left"/>
+      <w:pPr>
+        <w:tabs>
+          <w:tab w:val="num" w:pos="5040"/>
+        </w:tabs>
+        <w:ind w:left="5040" w:hanging="360"/>
+      </w:pPr>
+      <w:rPr>
+        <w:rFonts w:ascii="Symbol" w:hAnsi="Symbol" w:hint="default"/>
+        <w:sz w:val="20"/>
+      </w:rPr>
+    </w:lvl>
+    <w:lvl w:ilvl="7" w:tentative="1">
+      <w:start w:val="1"/>
+      <w:numFmt w:val="bullet"/>
+      <w:lvlText w:val=""/>
+      <w:lvlJc w:val="left"/>
+      <w:pPr>
+        <w:tabs>
+          <w:tab w:val="num" w:pos="5760"/>
+        </w:tabs>
+        <w:ind w:left="5760" w:hanging="360"/>
+      </w:pPr>
+      <w:rPr>
+        <w:rFonts w:ascii="Symbol" w:hAnsi="Symbol" w:hint="default"/>
+        <w:sz w:val="20"/>
+      </w:rPr>
+    </w:lvl>
+    <w:lvl w:ilvl="8" w:tentative="1">
+      <w:start w:val="1"/>
+      <w:numFmt w:val="bullet"/>
+      <w:lvlText w:val=""/>
+      <w:lvlJc w:val="left"/>
+      <w:pPr>
+        <w:tabs>
+          <w:tab w:val="num" w:pos="6480"/>
+        </w:tabs>
+        <w:ind w:left="6480" w:hanging="360"/>
+      </w:pPr>
+      <w:rPr>
+        <w:rFonts w:ascii="Symbol" w:hAnsi="Symbol" w:hint="default"/>
+        <w:sz w:val="20"/>
+      </w:rPr>
+    </w:lvl>
+  </w:abstractNum>
+  <w:abstractNum w:abstractNumId="10" w15:restartNumberingAfterBreak="0">
     <w:nsid w:val="76AB604E"/>
     <w:multiLevelType w:val="hybridMultilevel"/>
     <w:tmpl w:val="FE56E008"/>
@@ -7227,7 +6720,7 @@
       </w:rPr>
     </w:lvl>
   </w:abstractNum>
-  <w:abstractNum w:abstractNumId="9" w15:restartNumberingAfterBreak="0">
+  <w:abstractNum w:abstractNumId="11" w15:restartNumberingAfterBreak="0">
     <w:nsid w:val="773F6D95"/>
     <w:multiLevelType w:val="hybridMultilevel"/>
     <w:tmpl w:val="9A8A21A6"/>
@@ -7340,7 +6833,7 @@
       </w:rPr>
     </w:lvl>
   </w:abstractNum>
-  <w:abstractNum w:abstractNumId="10" w15:restartNumberingAfterBreak="0">
+  <w:abstractNum w:abstractNumId="12" w15:restartNumberingAfterBreak="0">
     <w:nsid w:val="7B37418D"/>
     <w:multiLevelType w:val="multilevel"/>
     <w:tmpl w:val="E94CB54E"/>
@@ -7454,37 +6947,43 @@
     </w:lvl>
   </w:abstractNum>
   <w:num w:numId="1" w16cid:durableId="1231113907">
+    <w:abstractNumId w:val="10"/>
+  </w:num>
+  <w:num w:numId="2" w16cid:durableId="1516457581">
+    <w:abstractNumId w:val="6"/>
+  </w:num>
+  <w:num w:numId="3" w16cid:durableId="744913510">
+    <w:abstractNumId w:val="11"/>
+  </w:num>
+  <w:num w:numId="4" w16cid:durableId="625893816">
+    <w:abstractNumId w:val="1"/>
+  </w:num>
+  <w:num w:numId="5" w16cid:durableId="1071125204">
+    <w:abstractNumId w:val="7"/>
+  </w:num>
+  <w:num w:numId="6" w16cid:durableId="1192760962">
+    <w:abstractNumId w:val="3"/>
+  </w:num>
+  <w:num w:numId="7" w16cid:durableId="720129007">
+    <w:abstractNumId w:val="5"/>
+  </w:num>
+  <w:num w:numId="8" w16cid:durableId="1898084569">
     <w:abstractNumId w:val="8"/>
   </w:num>
-  <w:num w:numId="2" w16cid:durableId="1516457581">
-    <w:abstractNumId w:val="5"/>
+  <w:num w:numId="9" w16cid:durableId="1909224161">
+    <w:abstractNumId w:val="12"/>
   </w:num>
-  <w:num w:numId="3" w16cid:durableId="744913510">
+  <w:num w:numId="10" w16cid:durableId="150752145">
+    <w:abstractNumId w:val="4"/>
+  </w:num>
+  <w:num w:numId="11" w16cid:durableId="1986278677">
+    <w:abstractNumId w:val="2"/>
+  </w:num>
+  <w:num w:numId="12" w16cid:durableId="102191493">
     <w:abstractNumId w:val="9"/>
   </w:num>
-  <w:num w:numId="4" w16cid:durableId="625893816">
+  <w:num w:numId="13" w16cid:durableId="241843089">
     <w:abstractNumId w:val="0"/>
-  </w:num>
-  <w:num w:numId="5" w16cid:durableId="1071125204">
-    <w:abstractNumId w:val="6"/>
-  </w:num>
-  <w:num w:numId="6" w16cid:durableId="1192760962">
-    <w:abstractNumId w:val="2"/>
-  </w:num>
-  <w:num w:numId="7" w16cid:durableId="720129007">
-    <w:abstractNumId w:val="4"/>
-  </w:num>
-  <w:num w:numId="8" w16cid:durableId="1898084569">
-    <w:abstractNumId w:val="7"/>
-  </w:num>
-  <w:num w:numId="9" w16cid:durableId="1909224161">
-    <w:abstractNumId w:val="10"/>
-  </w:num>
-  <w:num w:numId="10" w16cid:durableId="150752145">
-    <w:abstractNumId w:val="3"/>
-  </w:num>
-  <w:num w:numId="11" w16cid:durableId="1986278677">
-    <w:abstractNumId w:val="1"/>
   </w:num>
   <w:numIdMacAtCleanup w:val="1"/>
 </w:numbering>

</xml_diff>